<commit_message>
update main page and cv
</commit_message>
<xml_diff>
--- a/assets/pdf/CV-Yanghonghui Chen.docx
+++ b/assets/pdf/CV-Yanghonghui Chen.docx
@@ -6,7 +6,7 @@
       <w:tblPr>
         <w:tblStyle w:val="TableGrid"/>
         <w:tblpPr w:leftFromText="180" w:rightFromText="180" w:horzAnchor="margin" w:tblpXSpec="center" w:tblpY="-392"/>
-        <w:tblW w:w="0" w:type="auto"/>
+        <w:tblW w:w="10685" w:type="dxa"/>
         <w:tblBorders>
           <w:top w:val="dotted" w:sz="4" w:space="0" w:color="auto"/>
           <w:left w:val="dotted" w:sz="4" w:space="0" w:color="auto"/>
@@ -24,16 +24,15 @@
         <w:gridCol w:w="1226"/>
         <w:gridCol w:w="94"/>
         <w:gridCol w:w="137"/>
-        <w:gridCol w:w="271"/>
-        <w:gridCol w:w="135"/>
+        <w:gridCol w:w="623"/>
         <w:gridCol w:w="651"/>
-        <w:gridCol w:w="1439"/>
+        <w:gridCol w:w="1441"/>
       </w:tblGrid>
       <w:tr>
         <w:tc>
           <w:tcPr>
-            <w:tcW w:w="11335" w:type="dxa"/>
-            <w:gridSpan w:val="10"/>
+            <w:tcW w:w="10685" w:type="dxa"/>
+            <w:gridSpan w:val="9"/>
             <w:tcBorders>
               <w:top w:val="nil"/>
               <w:left w:val="nil"/>
@@ -214,8 +213,8 @@
         </w:trPr>
         <w:tc>
           <w:tcPr>
-            <w:tcW w:w="11335" w:type="dxa"/>
-            <w:gridSpan w:val="10"/>
+            <w:tcW w:w="10685" w:type="dxa"/>
+            <w:gridSpan w:val="9"/>
             <w:tcBorders>
               <w:top w:val="nil"/>
               <w:left w:val="nil"/>
@@ -251,7 +250,7 @@
       <w:tr>
         <w:tc>
           <w:tcPr>
-            <w:tcW w:w="7083" w:type="dxa"/>
+            <w:tcW w:w="6513" w:type="dxa"/>
             <w:gridSpan w:val="3"/>
             <w:tcBorders>
               <w:top w:val="nil"/>
@@ -282,8 +281,8 @@
         </w:tc>
         <w:tc>
           <w:tcPr>
-            <w:tcW w:w="4252" w:type="dxa"/>
-            <w:gridSpan w:val="7"/>
+            <w:tcW w:w="4172" w:type="dxa"/>
+            <w:gridSpan w:val="6"/>
             <w:tcBorders>
               <w:top w:val="nil"/>
               <w:left w:val="nil"/>
@@ -324,7 +323,7 @@
       <w:tr>
         <w:tc>
           <w:tcPr>
-            <w:tcW w:w="7083" w:type="dxa"/>
+            <w:tcW w:w="6513" w:type="dxa"/>
             <w:gridSpan w:val="3"/>
             <w:tcBorders>
               <w:top w:val="nil"/>
@@ -379,8 +378,8 @@
         </w:tc>
         <w:tc>
           <w:tcPr>
-            <w:tcW w:w="4252" w:type="dxa"/>
-            <w:gridSpan w:val="7"/>
+            <w:tcW w:w="4172" w:type="dxa"/>
+            <w:gridSpan w:val="6"/>
             <w:tcBorders>
               <w:top w:val="nil"/>
               <w:left w:val="nil"/>
@@ -448,7 +447,7 @@
         </w:trPr>
         <w:tc>
           <w:tcPr>
-            <w:tcW w:w="7083" w:type="dxa"/>
+            <w:tcW w:w="6513" w:type="dxa"/>
             <w:gridSpan w:val="3"/>
             <w:tcBorders>
               <w:top w:val="nil"/>
@@ -479,8 +478,8 @@
         </w:tc>
         <w:tc>
           <w:tcPr>
-            <w:tcW w:w="4252" w:type="dxa"/>
-            <w:gridSpan w:val="7"/>
+            <w:tcW w:w="4172" w:type="dxa"/>
+            <w:gridSpan w:val="6"/>
             <w:tcBorders>
               <w:top w:val="nil"/>
               <w:left w:val="nil"/>
@@ -513,7 +512,7 @@
       <w:tr>
         <w:tc>
           <w:tcPr>
-            <w:tcW w:w="7083" w:type="dxa"/>
+            <w:tcW w:w="6513" w:type="dxa"/>
             <w:gridSpan w:val="3"/>
             <w:tcBorders>
               <w:top w:val="nil"/>
@@ -560,8 +559,8 @@
         </w:tc>
         <w:tc>
           <w:tcPr>
-            <w:tcW w:w="4252" w:type="dxa"/>
-            <w:gridSpan w:val="7"/>
+            <w:tcW w:w="4172" w:type="dxa"/>
+            <w:gridSpan w:val="6"/>
             <w:tcBorders>
               <w:top w:val="nil"/>
               <w:left w:val="nil"/>
@@ -602,7 +601,7 @@
       <w:tr>
         <w:tc>
           <w:tcPr>
-            <w:tcW w:w="7083" w:type="dxa"/>
+            <w:tcW w:w="6513" w:type="dxa"/>
             <w:gridSpan w:val="3"/>
             <w:tcBorders>
               <w:top w:val="nil"/>
@@ -633,8 +632,8 @@
         </w:tc>
         <w:tc>
           <w:tcPr>
-            <w:tcW w:w="4252" w:type="dxa"/>
-            <w:gridSpan w:val="7"/>
+            <w:tcW w:w="4172" w:type="dxa"/>
+            <w:gridSpan w:val="6"/>
             <w:tcBorders>
               <w:top w:val="nil"/>
               <w:left w:val="nil"/>
@@ -683,7 +682,7 @@
       <w:tr>
         <w:tc>
           <w:tcPr>
-            <w:tcW w:w="7083" w:type="dxa"/>
+            <w:tcW w:w="6513" w:type="dxa"/>
             <w:gridSpan w:val="3"/>
             <w:tcBorders>
               <w:top w:val="nil"/>
@@ -746,8 +745,8 @@
         </w:tc>
         <w:tc>
           <w:tcPr>
-            <w:tcW w:w="4252" w:type="dxa"/>
-            <w:gridSpan w:val="7"/>
+            <w:tcW w:w="4172" w:type="dxa"/>
+            <w:gridSpan w:val="6"/>
             <w:tcBorders>
               <w:top w:val="nil"/>
               <w:left w:val="nil"/>
@@ -788,8 +787,8 @@
       <w:tr>
         <w:tc>
           <w:tcPr>
-            <w:tcW w:w="11335" w:type="dxa"/>
-            <w:gridSpan w:val="10"/>
+            <w:tcW w:w="10685" w:type="dxa"/>
+            <w:gridSpan w:val="9"/>
             <w:tcBorders>
               <w:top w:val="nil"/>
               <w:left w:val="nil"/>
@@ -1056,8 +1055,8 @@
       <w:tr>
         <w:tc>
           <w:tcPr>
-            <w:tcW w:w="11335" w:type="dxa"/>
-            <w:gridSpan w:val="10"/>
+            <w:tcW w:w="10685" w:type="dxa"/>
+            <w:gridSpan w:val="9"/>
             <w:tcBorders>
               <w:top w:val="nil"/>
               <w:left w:val="nil"/>
@@ -1084,7 +1083,7 @@
         </w:trPr>
         <w:tc>
           <w:tcPr>
-            <w:tcW w:w="7083" w:type="dxa"/>
+            <w:tcW w:w="6513" w:type="dxa"/>
             <w:gridSpan w:val="3"/>
             <w:tcBorders>
               <w:top w:val="nil"/>
@@ -1106,20 +1105,30 @@
             </w:pPr>
             <w:r>
               <w:rPr>
-                <w:rFonts w:ascii="Times New Roman" w:eastAsiaTheme="minorEastAsia" w:hAnsi="Times New Roman" w:cs="Times New Roman"/>
+                <w:rFonts w:ascii="Times New Roman" w:eastAsiaTheme="minorEastAsia" w:hAnsi="Times New Roman" w:cs="Times New Roman" w:hint="eastAsia"/>
                 <w:b/>
                 <w:sz w:val="28"/>
                 <w:szCs w:val="28"/>
                 <w:shd w:val="pct15" w:color="auto" w:fill="FFFFFF"/>
               </w:rPr>
-              <w:t>RESEARCH EXPERIENCES</w:t>
-            </w:r>
-          </w:p>
-        </w:tc>
-        <w:tc>
-          <w:tcPr>
-            <w:tcW w:w="4252" w:type="dxa"/>
-            <w:gridSpan w:val="7"/>
+              <w:t xml:space="preserve">PROJECT </w:t>
+            </w:r>
+            <w:r>
+              <w:rPr>
+                <w:rFonts w:ascii="Times New Roman" w:eastAsiaTheme="minorEastAsia" w:hAnsi="Times New Roman" w:cs="Times New Roman"/>
+                <w:b/>
+                <w:sz w:val="28"/>
+                <w:szCs w:val="28"/>
+                <w:shd w:val="pct15" w:color="auto" w:fill="FFFFFF"/>
+              </w:rPr>
+              <w:t>EXPERIENCES</w:t>
+            </w:r>
+          </w:p>
+        </w:tc>
+        <w:tc>
+          <w:tcPr>
+            <w:tcW w:w="4172" w:type="dxa"/>
+            <w:gridSpan w:val="6"/>
             <w:tcBorders>
               <w:top w:val="nil"/>
               <w:left w:val="nil"/>
@@ -1144,8 +1153,8 @@
       <w:tr>
         <w:tc>
           <w:tcPr>
-            <w:tcW w:w="11335" w:type="dxa"/>
-            <w:gridSpan w:val="10"/>
+            <w:tcW w:w="10685" w:type="dxa"/>
+            <w:gridSpan w:val="9"/>
             <w:tcBorders>
               <w:top w:val="single" w:sz="4" w:space="0" w:color="auto"/>
               <w:left w:val="nil"/>
@@ -1177,7 +1186,7 @@
       <w:tr>
         <w:tc>
           <w:tcPr>
-            <w:tcW w:w="5667" w:type="dxa"/>
+            <w:tcW w:w="5214" w:type="dxa"/>
             <w:tcBorders>
               <w:top w:val="nil"/>
               <w:left w:val="nil"/>
@@ -1203,13 +1212,23 @@
               </w:rPr>
               <w:t xml:space="preserve">Senior Design (Advisor: Prof. </w:t>
             </w:r>
-            <w:r>
-              <w:rPr>
-                <w:rFonts w:ascii="Times New Roman" w:eastAsiaTheme="minorEastAsia" w:hAnsi="Times New Roman" w:cs="Times New Roman"/>
-                <w:bCs/>
-                <w:szCs w:val="22"/>
-              </w:rPr>
-              <w:t>Oleskiy Penkov</w:t>
+            <w:proofErr w:type="spellStart"/>
+            <w:r>
+              <w:rPr>
+                <w:rFonts w:ascii="Times New Roman" w:eastAsiaTheme="minorEastAsia" w:hAnsi="Times New Roman" w:cs="Times New Roman"/>
+                <w:bCs/>
+                <w:szCs w:val="22"/>
+              </w:rPr>
+              <w:t>Oleskiy</w:t>
+            </w:r>
+            <w:proofErr w:type="spellEnd"/>
+            <w:r>
+              <w:rPr>
+                <w:rFonts w:ascii="Times New Roman" w:eastAsiaTheme="minorEastAsia" w:hAnsi="Times New Roman" w:cs="Times New Roman"/>
+                <w:bCs/>
+                <w:szCs w:val="22"/>
+              </w:rPr>
+              <w:t xml:space="preserve"> Penkov</w:t>
             </w:r>
             <w:r>
               <w:rPr>
@@ -1223,8 +1242,8 @@
         </w:tc>
         <w:tc>
           <w:tcPr>
-            <w:tcW w:w="5668" w:type="dxa"/>
-            <w:gridSpan w:val="9"/>
+            <w:tcW w:w="5471" w:type="dxa"/>
+            <w:gridSpan w:val="8"/>
             <w:tcBorders>
               <w:top w:val="nil"/>
               <w:left w:val="nil"/>
@@ -1248,7 +1267,15 @@
                 <w:bCs/>
                 <w:szCs w:val="22"/>
               </w:rPr>
-              <w:t xml:space="preserve">                                                        </w:t>
+              <w:t xml:space="preserve">                                                </w:t>
+            </w:r>
+            <w:r>
+              <w:rPr>
+                <w:rFonts w:ascii="Times New Roman" w:eastAsiaTheme="minorEastAsia" w:hAnsi="Times New Roman" w:cs="Times New Roman" w:hint="eastAsia"/>
+                <w:bCs/>
+                <w:szCs w:val="22"/>
+              </w:rPr>
+              <w:t xml:space="preserve">    </w:t>
             </w:r>
             <w:r>
               <w:rPr>
@@ -1272,7 +1299,23 @@
                 <w:bCs/>
                 <w:szCs w:val="22"/>
               </w:rPr>
-              <w:t xml:space="preserve"> - May 2025</w:t>
+              <w:t xml:space="preserve"> - May</w:t>
+            </w:r>
+            <w:r>
+              <w:rPr>
+                <w:rFonts w:ascii="Times New Roman" w:eastAsiaTheme="minorEastAsia" w:hAnsi="Times New Roman" w:cs="Times New Roman" w:hint="eastAsia"/>
+                <w:bCs/>
+                <w:szCs w:val="22"/>
+              </w:rPr>
+              <w:t xml:space="preserve"> </w:t>
+            </w:r>
+            <w:r>
+              <w:rPr>
+                <w:rFonts w:ascii="Times New Roman" w:eastAsiaTheme="minorEastAsia" w:hAnsi="Times New Roman" w:cs="Times New Roman"/>
+                <w:bCs/>
+                <w:szCs w:val="22"/>
+              </w:rPr>
+              <w:t>2025</w:t>
             </w:r>
           </w:p>
         </w:tc>
@@ -1280,8 +1323,8 @@
       <w:tr>
         <w:tc>
           <w:tcPr>
-            <w:tcW w:w="11335" w:type="dxa"/>
-            <w:gridSpan w:val="10"/>
+            <w:tcW w:w="10685" w:type="dxa"/>
+            <w:gridSpan w:val="9"/>
             <w:tcBorders>
               <w:top w:val="nil"/>
               <w:left w:val="nil"/>
@@ -1435,8 +1478,8 @@
       <w:tr>
         <w:tc>
           <w:tcPr>
-            <w:tcW w:w="11335" w:type="dxa"/>
-            <w:gridSpan w:val="10"/>
+            <w:tcW w:w="10685" w:type="dxa"/>
+            <w:gridSpan w:val="9"/>
             <w:tcBorders>
               <w:top w:val="nil"/>
               <w:left w:val="nil"/>
@@ -1484,7 +1527,7 @@
       <w:tr>
         <w:tc>
           <w:tcPr>
-            <w:tcW w:w="8411" w:type="dxa"/>
+            <w:tcW w:w="7739" w:type="dxa"/>
             <w:gridSpan w:val="4"/>
             <w:tcBorders>
               <w:top w:val="nil"/>
@@ -1515,8 +1558,8 @@
         </w:tc>
         <w:tc>
           <w:tcPr>
-            <w:tcW w:w="2924" w:type="dxa"/>
-            <w:gridSpan w:val="6"/>
+            <w:tcW w:w="2946" w:type="dxa"/>
+            <w:gridSpan w:val="5"/>
             <w:tcBorders>
               <w:top w:val="nil"/>
               <w:left w:val="nil"/>
@@ -1540,7 +1583,23 @@
                 <w:bCs/>
                 <w:szCs w:val="22"/>
               </w:rPr>
-              <w:t xml:space="preserve">       </w:t>
+              <w:t xml:space="preserve">  </w:t>
+            </w:r>
+            <w:r>
+              <w:rPr>
+                <w:rFonts w:ascii="Times New Roman" w:eastAsiaTheme="minorEastAsia" w:hAnsi="Times New Roman" w:cs="Times New Roman" w:hint="eastAsia"/>
+                <w:bCs/>
+                <w:szCs w:val="22"/>
+              </w:rPr>
+              <w:t xml:space="preserve"> </w:t>
+            </w:r>
+            <w:r>
+              <w:rPr>
+                <w:rFonts w:ascii="Times New Roman" w:eastAsiaTheme="minorEastAsia" w:hAnsi="Times New Roman" w:cs="Times New Roman" w:hint="eastAsia"/>
+                <w:bCs/>
+                <w:szCs w:val="22"/>
+              </w:rPr>
+              <w:t xml:space="preserve">    </w:t>
             </w:r>
             <w:r>
               <w:rPr>
@@ -1572,8 +1631,8 @@
       <w:tr>
         <w:tc>
           <w:tcPr>
-            <w:tcW w:w="11335" w:type="dxa"/>
-            <w:gridSpan w:val="10"/>
+            <w:tcW w:w="10685" w:type="dxa"/>
+            <w:gridSpan w:val="9"/>
             <w:tcBorders>
               <w:top w:val="nil"/>
               <w:left w:val="nil"/>
@@ -1639,7 +1698,31 @@
                 <w:sz w:val="20"/>
                 <w:szCs w:val="20"/>
               </w:rPr>
-              <w:t>Federated Learning, Personalized FL (pFedMe), EEG, Seizure Prediction</w:t>
+              <w:t>Federated Learning, Personalized FL (</w:t>
+            </w:r>
+            <w:proofErr w:type="spellStart"/>
+            <w:r>
+              <w:rPr>
+                <w:rFonts w:ascii="Times New Roman" w:eastAsiaTheme="minorEastAsia" w:hAnsi="Times New Roman" w:cs="Times New Roman"/>
+                <w:bCs/>
+                <w:i/>
+                <w:iCs/>
+                <w:sz w:val="20"/>
+                <w:szCs w:val="20"/>
+              </w:rPr>
+              <w:t>pFedMe</w:t>
+            </w:r>
+            <w:proofErr w:type="spellEnd"/>
+            <w:r>
+              <w:rPr>
+                <w:rFonts w:ascii="Times New Roman" w:eastAsiaTheme="minorEastAsia" w:hAnsi="Times New Roman" w:cs="Times New Roman"/>
+                <w:bCs/>
+                <w:i/>
+                <w:iCs/>
+                <w:sz w:val="20"/>
+                <w:szCs w:val="20"/>
+              </w:rPr>
+              <w:t>), EEG, Seizure Prediction</w:t>
             </w:r>
           </w:p>
           <w:p>
@@ -1663,7 +1746,25 @@
                 <w:bCs/>
                 <w:szCs w:val="22"/>
               </w:rPr>
-              <w:t>Designed and implemented a privacy-preserving pipeline for seizure prediction, processing EEG signals into Pearson Correlation Coefficient (PCC) matrices and training a CNN classifier using four distinct paradigms: Local, Centralized, FedAvg, and pFedMe.</w:t>
+              <w:t xml:space="preserve">Designed and implemented a privacy-preserving pipeline for seizure prediction, processing EEG signals into Pearson Correlation Coefficient (PCC) matrices and training a CNN classifier using four distinct paradigms: Local, Centralized, FedAvg, and </w:t>
+            </w:r>
+            <w:proofErr w:type="spellStart"/>
+            <w:r>
+              <w:rPr>
+                <w:rFonts w:ascii="Times New Roman" w:eastAsiaTheme="minorEastAsia" w:hAnsi="Times New Roman" w:cs="Times New Roman"/>
+                <w:bCs/>
+                <w:szCs w:val="22"/>
+              </w:rPr>
+              <w:t>pFedMe</w:t>
+            </w:r>
+            <w:proofErr w:type="spellEnd"/>
+            <w:r>
+              <w:rPr>
+                <w:rFonts w:ascii="Times New Roman" w:eastAsiaTheme="minorEastAsia" w:hAnsi="Times New Roman" w:cs="Times New Roman"/>
+                <w:bCs/>
+                <w:szCs w:val="22"/>
+              </w:rPr>
+              <w:t>.</w:t>
             </w:r>
           </w:p>
           <w:p>
@@ -1687,7 +1788,25 @@
                 <w:bCs/>
                 <w:szCs w:val="22"/>
               </w:rPr>
-              <w:t>Demonstrated that standard FedAvg underperforms due to client data heterogeneity and severe class imbalance, while personalized pFedMe significantly improves average sensitivity and F1-scores over FedAvg by adapting to unique patient data.</w:t>
+              <w:t xml:space="preserve">Demonstrated that standard FedAvg underperforms due to client data heterogeneity and severe class imbalance, while personalized </w:t>
+            </w:r>
+            <w:proofErr w:type="spellStart"/>
+            <w:r>
+              <w:rPr>
+                <w:rFonts w:ascii="Times New Roman" w:eastAsiaTheme="minorEastAsia" w:hAnsi="Times New Roman" w:cs="Times New Roman"/>
+                <w:bCs/>
+                <w:szCs w:val="22"/>
+              </w:rPr>
+              <w:t>pFedMe</w:t>
+            </w:r>
+            <w:proofErr w:type="spellEnd"/>
+            <w:r>
+              <w:rPr>
+                <w:rFonts w:ascii="Times New Roman" w:eastAsiaTheme="minorEastAsia" w:hAnsi="Times New Roman" w:cs="Times New Roman"/>
+                <w:bCs/>
+                <w:szCs w:val="22"/>
+              </w:rPr>
+              <w:t xml:space="preserve"> significantly improves average sensitivity and F1-scores over FedAvg by adapting to unique patient data.</w:t>
             </w:r>
           </w:p>
           <w:p>
@@ -1711,7 +1830,25 @@
                 <w:bCs/>
                 <w:szCs w:val="22"/>
               </w:rPr>
-              <w:t>Conducted a detailed hyperparameter analysis of the pFedMe personalization weight (λ), revealing that smaller λ values are critical for minority class detection (sensitivity), whereas larger values cause performance to collapse by forcing adherence to a globally biased model.</w:t>
+              <w:t xml:space="preserve">Conducted a detailed hyperparameter analysis of the </w:t>
+            </w:r>
+            <w:proofErr w:type="spellStart"/>
+            <w:r>
+              <w:rPr>
+                <w:rFonts w:ascii="Times New Roman" w:eastAsiaTheme="minorEastAsia" w:hAnsi="Times New Roman" w:cs="Times New Roman"/>
+                <w:bCs/>
+                <w:szCs w:val="22"/>
+              </w:rPr>
+              <w:t>pFedMe</w:t>
+            </w:r>
+            <w:proofErr w:type="spellEnd"/>
+            <w:r>
+              <w:rPr>
+                <w:rFonts w:ascii="Times New Roman" w:eastAsiaTheme="minorEastAsia" w:hAnsi="Times New Roman" w:cs="Times New Roman"/>
+                <w:bCs/>
+                <w:szCs w:val="22"/>
+              </w:rPr>
+              <w:t xml:space="preserve"> personalization weight (λ), revealing that smaller λ values are critical for minority class detection (sensitivity), whereas larger values cause performance to collapse by forcing adherence to a globally biased model.</w:t>
             </w:r>
           </w:p>
         </w:tc>
@@ -1719,7 +1856,7 @@
       <w:tr>
         <w:tc>
           <w:tcPr>
-            <w:tcW w:w="8411" w:type="dxa"/>
+            <w:tcW w:w="7739" w:type="dxa"/>
             <w:gridSpan w:val="4"/>
             <w:tcBorders>
               <w:top w:val="nil"/>
@@ -1750,8 +1887,8 @@
         </w:tc>
         <w:tc>
           <w:tcPr>
-            <w:tcW w:w="2924" w:type="dxa"/>
-            <w:gridSpan w:val="6"/>
+            <w:tcW w:w="2946" w:type="dxa"/>
+            <w:gridSpan w:val="5"/>
             <w:tcBorders>
               <w:top w:val="nil"/>
               <w:left w:val="nil"/>
@@ -1775,7 +1912,7 @@
       <w:tr>
         <w:tc>
           <w:tcPr>
-            <w:tcW w:w="7083" w:type="dxa"/>
+            <w:tcW w:w="6513" w:type="dxa"/>
             <w:gridSpan w:val="3"/>
             <w:tcBorders>
               <w:top w:val="nil"/>
@@ -1822,8 +1959,8 @@
         </w:tc>
         <w:tc>
           <w:tcPr>
-            <w:tcW w:w="4252" w:type="dxa"/>
-            <w:gridSpan w:val="7"/>
+            <w:tcW w:w="4172" w:type="dxa"/>
+            <w:gridSpan w:val="6"/>
             <w:tcBorders>
               <w:top w:val="nil"/>
               <w:left w:val="nil"/>
@@ -1847,7 +1984,23 @@
                 <w:bCs/>
                 <w:szCs w:val="22"/>
               </w:rPr>
-              <w:t xml:space="preserve">                        </w:t>
+              <w:t xml:space="preserve">                 </w:t>
+            </w:r>
+            <w:r>
+              <w:rPr>
+                <w:rFonts w:ascii="Times New Roman" w:eastAsiaTheme="minorEastAsia" w:hAnsi="Times New Roman" w:cs="Times New Roman" w:hint="eastAsia"/>
+                <w:bCs/>
+                <w:szCs w:val="22"/>
+              </w:rPr>
+              <w:t xml:space="preserve"> </w:t>
+            </w:r>
+            <w:r>
+              <w:rPr>
+                <w:rFonts w:ascii="Times New Roman" w:eastAsiaTheme="minorEastAsia" w:hAnsi="Times New Roman" w:cs="Times New Roman" w:hint="eastAsia"/>
+                <w:bCs/>
+                <w:szCs w:val="22"/>
+              </w:rPr>
+              <w:t xml:space="preserve">    </w:t>
             </w:r>
             <w:r>
               <w:rPr>
@@ -1887,8 +2040,8 @@
       <w:tr>
         <w:tc>
           <w:tcPr>
-            <w:tcW w:w="11335" w:type="dxa"/>
-            <w:gridSpan w:val="10"/>
+            <w:tcW w:w="10685" w:type="dxa"/>
+            <w:gridSpan w:val="9"/>
             <w:tcBorders>
               <w:top w:val="nil"/>
               <w:left w:val="nil"/>
@@ -2021,7 +2174,6 @@
                 <w:bCs/>
                 <w:szCs w:val="22"/>
               </w:rPr>
-              <w:lastRenderedPageBreak/>
               <w:t>Implemented a GPU-based forward convolution with a structured Prolog-Kernel-Epilog approach, ensuring memory management, convolution computation, and output transfer, while matching CPU implementation correctness and optimizing performance using Nsight profiling tools.</w:t>
             </w:r>
           </w:p>
@@ -2046,6 +2198,7 @@
                 <w:bCs/>
                 <w:szCs w:val="22"/>
               </w:rPr>
+              <w:lastRenderedPageBreak/>
               <w:t>Applied advanced GPU programming techniques</w:t>
             </w:r>
             <w:r>
@@ -2062,25 +2215,7 @@
                 <w:bCs/>
                 <w:szCs w:val="22"/>
               </w:rPr>
-              <w:t xml:space="preserve">, including streams, GEMM kernels, and kernel fusion, to achieve a target inference time </w:t>
-            </w:r>
-            <w:proofErr w:type="gramStart"/>
-            <w:r>
-              <w:rPr>
-                <w:rFonts w:ascii="Times New Roman" w:eastAsiaTheme="minorEastAsia" w:hAnsi="Times New Roman" w:cs="Times New Roman"/>
-                <w:bCs/>
-                <w:szCs w:val="22"/>
-              </w:rPr>
-              <w:t>of ≤80ms for</w:t>
-            </w:r>
-            <w:proofErr w:type="gramEnd"/>
-            <w:r>
-              <w:rPr>
-                <w:rFonts w:ascii="Times New Roman" w:eastAsiaTheme="minorEastAsia" w:hAnsi="Times New Roman" w:cs="Times New Roman"/>
-                <w:bCs/>
-                <w:szCs w:val="22"/>
-              </w:rPr>
-              <w:t xml:space="preserve"> 10,000 images from the Fashion MNIST dataset.</w:t>
+              <w:t>, including streams, GEMM kernels, and kernel fusion, to achieve a target inference time of ≤80ms for 10,000 images from the Fashion MNIST dataset.</w:t>
             </w:r>
           </w:p>
         </w:tc>
@@ -2088,7 +2223,7 @@
       <w:tr>
         <w:tc>
           <w:tcPr>
-            <w:tcW w:w="8411" w:type="dxa"/>
+            <w:tcW w:w="7739" w:type="dxa"/>
             <w:gridSpan w:val="4"/>
             <w:tcBorders>
               <w:top w:val="nil"/>
@@ -2120,8 +2255,8 @@
         </w:tc>
         <w:tc>
           <w:tcPr>
-            <w:tcW w:w="2924" w:type="dxa"/>
-            <w:gridSpan w:val="6"/>
+            <w:tcW w:w="2946" w:type="dxa"/>
+            <w:gridSpan w:val="5"/>
             <w:tcBorders>
               <w:top w:val="nil"/>
               <w:left w:val="nil"/>
@@ -2145,7 +2280,7 @@
       <w:tr>
         <w:tc>
           <w:tcPr>
-            <w:tcW w:w="7083" w:type="dxa"/>
+            <w:tcW w:w="6513" w:type="dxa"/>
             <w:gridSpan w:val="3"/>
             <w:tcBorders>
               <w:top w:val="nil"/>
@@ -2218,8 +2353,8 @@
         </w:tc>
         <w:tc>
           <w:tcPr>
-            <w:tcW w:w="4252" w:type="dxa"/>
-            <w:gridSpan w:val="7"/>
+            <w:tcW w:w="4172" w:type="dxa"/>
+            <w:gridSpan w:val="6"/>
             <w:tcBorders>
               <w:top w:val="nil"/>
               <w:left w:val="nil"/>
@@ -2268,8 +2403,8 @@
       <w:tr>
         <w:tc>
           <w:tcPr>
-            <w:tcW w:w="11335" w:type="dxa"/>
-            <w:gridSpan w:val="10"/>
+            <w:tcW w:w="10685" w:type="dxa"/>
+            <w:gridSpan w:val="9"/>
             <w:tcBorders>
               <w:top w:val="nil"/>
               <w:left w:val="nil"/>
@@ -2424,7 +2559,25 @@
                 <w:bCs/>
                 <w:szCs w:val="22"/>
               </w:rPr>
-              <w:t>Contributed to combining the BCIC IV IIa and the P300 RSVP datasets and designing an</w:t>
+              <w:t xml:space="preserve">Contributed to combining the BCIC IV </w:t>
+            </w:r>
+            <w:proofErr w:type="spellStart"/>
+            <w:r>
+              <w:rPr>
+                <w:rFonts w:ascii="Times New Roman" w:eastAsiaTheme="minorEastAsia" w:hAnsi="Times New Roman" w:cs="Times New Roman"/>
+                <w:bCs/>
+                <w:szCs w:val="22"/>
+              </w:rPr>
+              <w:t>IIa</w:t>
+            </w:r>
+            <w:proofErr w:type="spellEnd"/>
+            <w:r>
+              <w:rPr>
+                <w:rFonts w:ascii="Times New Roman" w:eastAsiaTheme="minorEastAsia" w:hAnsi="Times New Roman" w:cs="Times New Roman"/>
+                <w:bCs/>
+                <w:szCs w:val="22"/>
+              </w:rPr>
+              <w:t xml:space="preserve"> and the P300 RSVP datasets and designing an</w:t>
             </w:r>
             <w:r>
               <w:rPr>
@@ -2488,8 +2641,8 @@
       <w:tr>
         <w:tc>
           <w:tcPr>
-            <w:tcW w:w="9776" w:type="dxa"/>
-            <w:gridSpan w:val="9"/>
+            <w:tcW w:w="9244" w:type="dxa"/>
+            <w:gridSpan w:val="8"/>
             <w:tcBorders>
               <w:top w:val="nil"/>
               <w:left w:val="nil"/>
@@ -2543,7 +2696,7 @@
         </w:tc>
         <w:tc>
           <w:tcPr>
-            <w:tcW w:w="1559" w:type="dxa"/>
+            <w:tcW w:w="1441" w:type="dxa"/>
             <w:tcBorders>
               <w:top w:val="nil"/>
               <w:left w:val="nil"/>
@@ -2568,7 +2721,7 @@
       <w:tr>
         <w:tc>
           <w:tcPr>
-            <w:tcW w:w="8642" w:type="dxa"/>
+            <w:tcW w:w="7970" w:type="dxa"/>
             <w:gridSpan w:val="6"/>
             <w:tcBorders>
               <w:top w:val="nil"/>
@@ -2614,8 +2767,8 @@
         </w:tc>
         <w:tc>
           <w:tcPr>
-            <w:tcW w:w="2693" w:type="dxa"/>
-            <w:gridSpan w:val="4"/>
+            <w:tcW w:w="2715" w:type="dxa"/>
+            <w:gridSpan w:val="3"/>
             <w:tcBorders>
               <w:top w:val="nil"/>
               <w:bottom w:val="nil"/>
@@ -2647,8 +2800,8 @@
       <w:tr>
         <w:tc>
           <w:tcPr>
-            <w:tcW w:w="11335" w:type="dxa"/>
-            <w:gridSpan w:val="10"/>
+            <w:tcW w:w="10685" w:type="dxa"/>
+            <w:gridSpan w:val="9"/>
             <w:tcBorders>
               <w:top w:val="nil"/>
               <w:left w:val="nil"/>
@@ -2874,7 +3027,43 @@
                 <w:bCs/>
                 <w:szCs w:val="22"/>
               </w:rPr>
-              <w:t>Implemented MTCNN with ResNet and dlib-based face recognition, achieving better performance with the latter; trained the system with one hundred face images for live recognition.</w:t>
+              <w:t xml:space="preserve">Implemented MTCNN with </w:t>
+            </w:r>
+            <w:proofErr w:type="spellStart"/>
+            <w:r>
+              <w:rPr>
+                <w:rFonts w:ascii="Times New Roman" w:eastAsiaTheme="minorEastAsia" w:hAnsi="Times New Roman" w:cs="Times New Roman"/>
+                <w:bCs/>
+                <w:szCs w:val="22"/>
+              </w:rPr>
+              <w:t>ResNet</w:t>
+            </w:r>
+            <w:proofErr w:type="spellEnd"/>
+            <w:r>
+              <w:rPr>
+                <w:rFonts w:ascii="Times New Roman" w:eastAsiaTheme="minorEastAsia" w:hAnsi="Times New Roman" w:cs="Times New Roman"/>
+                <w:bCs/>
+                <w:szCs w:val="22"/>
+              </w:rPr>
+              <w:t xml:space="preserve"> and </w:t>
+            </w:r>
+            <w:proofErr w:type="spellStart"/>
+            <w:r>
+              <w:rPr>
+                <w:rFonts w:ascii="Times New Roman" w:eastAsiaTheme="minorEastAsia" w:hAnsi="Times New Roman" w:cs="Times New Roman"/>
+                <w:bCs/>
+                <w:szCs w:val="22"/>
+              </w:rPr>
+              <w:t>dlib</w:t>
+            </w:r>
+            <w:proofErr w:type="spellEnd"/>
+            <w:r>
+              <w:rPr>
+                <w:rFonts w:ascii="Times New Roman" w:eastAsiaTheme="minorEastAsia" w:hAnsi="Times New Roman" w:cs="Times New Roman"/>
+                <w:bCs/>
+                <w:szCs w:val="22"/>
+              </w:rPr>
+              <w:t>-based face recognition, achieving better performance with the latter; trained the system with one hundred face images for live recognition.</w:t>
             </w:r>
           </w:p>
           <w:p>
@@ -2898,7 +3087,25 @@
                 <w:bCs/>
                 <w:szCs w:val="22"/>
               </w:rPr>
-              <w:t>Built a custom residual neural network with Keras for speaker recognition, achieving 96% accuracy.</w:t>
+              <w:t xml:space="preserve">Built a custom residual neural network with </w:t>
+            </w:r>
+            <w:proofErr w:type="spellStart"/>
+            <w:r>
+              <w:rPr>
+                <w:rFonts w:ascii="Times New Roman" w:eastAsiaTheme="minorEastAsia" w:hAnsi="Times New Roman" w:cs="Times New Roman"/>
+                <w:bCs/>
+                <w:szCs w:val="22"/>
+              </w:rPr>
+              <w:t>Keras</w:t>
+            </w:r>
+            <w:proofErr w:type="spellEnd"/>
+            <w:r>
+              <w:rPr>
+                <w:rFonts w:ascii="Times New Roman" w:eastAsiaTheme="minorEastAsia" w:hAnsi="Times New Roman" w:cs="Times New Roman"/>
+                <w:bCs/>
+                <w:szCs w:val="22"/>
+              </w:rPr>
+              <w:t xml:space="preserve"> for speaker recognition, achieving 96% accuracy.</w:t>
             </w:r>
           </w:p>
           <w:p>
@@ -2931,8 +3138,8 @@
       <w:tr>
         <w:tc>
           <w:tcPr>
-            <w:tcW w:w="9776" w:type="dxa"/>
-            <w:gridSpan w:val="9"/>
+            <w:tcW w:w="9244" w:type="dxa"/>
+            <w:gridSpan w:val="8"/>
             <w:tcBorders>
               <w:top w:val="nil"/>
               <w:left w:val="nil"/>
@@ -3037,7 +3244,7 @@
         </w:tc>
         <w:tc>
           <w:tcPr>
-            <w:tcW w:w="1559" w:type="dxa"/>
+            <w:tcW w:w="1441" w:type="dxa"/>
             <w:tcBorders>
               <w:top w:val="nil"/>
               <w:left w:val="nil"/>
@@ -3062,8 +3269,8 @@
       <w:tr>
         <w:tc>
           <w:tcPr>
-            <w:tcW w:w="8931" w:type="dxa"/>
-            <w:gridSpan w:val="7"/>
+            <w:tcW w:w="7970" w:type="dxa"/>
+            <w:gridSpan w:val="6"/>
             <w:tcBorders>
               <w:top w:val="nil"/>
               <w:left w:val="nil"/>
@@ -3089,13 +3296,23 @@
               </w:rPr>
               <w:t xml:space="preserve">Course Project (Advisor: Prof. </w:t>
             </w:r>
-            <w:r>
-              <w:rPr>
-                <w:rFonts w:ascii="Times New Roman" w:eastAsiaTheme="minorEastAsia" w:hAnsi="Times New Roman" w:cs="Times New Roman"/>
-                <w:bCs/>
-                <w:szCs w:val="22"/>
-              </w:rPr>
-              <w:t>Zuofu Cheng</w:t>
+            <w:proofErr w:type="spellStart"/>
+            <w:r>
+              <w:rPr>
+                <w:rFonts w:ascii="Times New Roman" w:eastAsiaTheme="minorEastAsia" w:hAnsi="Times New Roman" w:cs="Times New Roman"/>
+                <w:bCs/>
+                <w:szCs w:val="22"/>
+              </w:rPr>
+              <w:t>Zuofu</w:t>
+            </w:r>
+            <w:proofErr w:type="spellEnd"/>
+            <w:r>
+              <w:rPr>
+                <w:rFonts w:ascii="Times New Roman" w:eastAsiaTheme="minorEastAsia" w:hAnsi="Times New Roman" w:cs="Times New Roman"/>
+                <w:bCs/>
+                <w:szCs w:val="22"/>
+              </w:rPr>
+              <w:t xml:space="preserve"> Cheng</w:t>
             </w:r>
             <w:r>
               <w:rPr>
@@ -3109,7 +3326,7 @@
         </w:tc>
         <w:tc>
           <w:tcPr>
-            <w:tcW w:w="2404" w:type="dxa"/>
+            <w:tcW w:w="2715" w:type="dxa"/>
             <w:gridSpan w:val="3"/>
             <w:tcBorders>
               <w:top w:val="nil"/>
@@ -3122,20 +3339,19 @@
             <w:pPr>
               <w:spacing w:after="0" w:line="259" w:lineRule="auto"/>
               <w:ind w:left="0" w:firstLine="0"/>
-              <w:jc w:val="right"/>
-              <w:rPr>
-                <w:rFonts w:ascii="Times New Roman" w:eastAsiaTheme="minorEastAsia" w:hAnsi="Times New Roman" w:cs="Times New Roman"/>
-                <w:bCs/>
-                <w:szCs w:val="22"/>
-              </w:rPr>
-            </w:pPr>
-            <w:r>
-              <w:rPr>
-                <w:rFonts w:ascii="Times New Roman" w:eastAsiaTheme="minorEastAsia" w:hAnsi="Times New Roman" w:cs="Times New Roman" w:hint="eastAsia"/>
-                <w:bCs/>
-                <w:szCs w:val="22"/>
-              </w:rPr>
-              <w:t>March 2024 - May 2024</w:t>
+              <w:rPr>
+                <w:rFonts w:ascii="Times New Roman" w:eastAsiaTheme="minorEastAsia" w:hAnsi="Times New Roman" w:cs="Times New Roman" w:hint="eastAsia"/>
+                <w:bCs/>
+                <w:szCs w:val="22"/>
+              </w:rPr>
+            </w:pPr>
+            <w:r>
+              <w:rPr>
+                <w:rFonts w:ascii="Times New Roman" w:eastAsiaTheme="minorEastAsia" w:hAnsi="Times New Roman" w:cs="Times New Roman" w:hint="eastAsia"/>
+                <w:bCs/>
+                <w:szCs w:val="22"/>
+              </w:rPr>
+              <w:t xml:space="preserve">       March 2024 -May 2024           </w:t>
             </w:r>
           </w:p>
         </w:tc>
@@ -3143,8 +3359,8 @@
       <w:tr>
         <w:tc>
           <w:tcPr>
-            <w:tcW w:w="11335" w:type="dxa"/>
-            <w:gridSpan w:val="10"/>
+            <w:tcW w:w="10685" w:type="dxa"/>
+            <w:gridSpan w:val="9"/>
             <w:tcBorders>
               <w:top w:val="nil"/>
               <w:left w:val="nil"/>
@@ -3185,7 +3401,31 @@
                 <w:sz w:val="20"/>
                 <w:szCs w:val="20"/>
               </w:rPr>
-              <w:t>: SystemVerilog, FPGA</w:t>
+              <w:t xml:space="preserve">: </w:t>
+            </w:r>
+            <w:proofErr w:type="spellStart"/>
+            <w:r>
+              <w:rPr>
+                <w:rFonts w:ascii="Times New Roman" w:eastAsiaTheme="minorEastAsia" w:hAnsi="Times New Roman" w:cs="Times New Roman"/>
+                <w:bCs/>
+                <w:i/>
+                <w:iCs/>
+                <w:sz w:val="20"/>
+                <w:szCs w:val="20"/>
+              </w:rPr>
+              <w:t>SystemVerilog</w:t>
+            </w:r>
+            <w:proofErr w:type="spellEnd"/>
+            <w:r>
+              <w:rPr>
+                <w:rFonts w:ascii="Times New Roman" w:eastAsiaTheme="minorEastAsia" w:hAnsi="Times New Roman" w:cs="Times New Roman"/>
+                <w:bCs/>
+                <w:i/>
+                <w:iCs/>
+                <w:sz w:val="20"/>
+                <w:szCs w:val="20"/>
+              </w:rPr>
+              <w:t>, FPGA</w:t>
             </w:r>
             <w:r>
               <w:rPr>
@@ -3350,8 +3590,8 @@
       <w:tr>
         <w:tc>
           <w:tcPr>
-            <w:tcW w:w="9776" w:type="dxa"/>
-            <w:gridSpan w:val="9"/>
+            <w:tcW w:w="9244" w:type="dxa"/>
+            <w:gridSpan w:val="8"/>
             <w:tcBorders>
               <w:top w:val="nil"/>
               <w:left w:val="nil"/>
@@ -3384,7 +3624,7 @@
         </w:tc>
         <w:tc>
           <w:tcPr>
-            <w:tcW w:w="1559" w:type="dxa"/>
+            <w:tcW w:w="1441" w:type="dxa"/>
             <w:tcBorders>
               <w:top w:val="nil"/>
               <w:left w:val="nil"/>
@@ -3409,7 +3649,7 @@
       <w:tr>
         <w:tc>
           <w:tcPr>
-            <w:tcW w:w="8505" w:type="dxa"/>
+            <w:tcW w:w="7833" w:type="dxa"/>
             <w:gridSpan w:val="5"/>
             <w:tcBorders>
               <w:top w:val="nil"/>
@@ -3464,8 +3704,8 @@
         </w:tc>
         <w:tc>
           <w:tcPr>
-            <w:tcW w:w="2830" w:type="dxa"/>
-            <w:gridSpan w:val="5"/>
+            <w:tcW w:w="2852" w:type="dxa"/>
+            <w:gridSpan w:val="4"/>
             <w:tcBorders>
               <w:top w:val="nil"/>
               <w:left w:val="nil"/>
@@ -3498,8 +3738,8 @@
       <w:tr>
         <w:tc>
           <w:tcPr>
-            <w:tcW w:w="11335" w:type="dxa"/>
-            <w:gridSpan w:val="10"/>
+            <w:tcW w:w="10685" w:type="dxa"/>
+            <w:gridSpan w:val="9"/>
             <w:tcBorders>
               <w:top w:val="nil"/>
               <w:left w:val="nil"/>
@@ -3788,8 +4028,8 @@
       <w:tr>
         <w:tc>
           <w:tcPr>
-            <w:tcW w:w="9776" w:type="dxa"/>
-            <w:gridSpan w:val="9"/>
+            <w:tcW w:w="9244" w:type="dxa"/>
+            <w:gridSpan w:val="8"/>
             <w:tcBorders>
               <w:top w:val="nil"/>
               <w:left w:val="nil"/>
@@ -3819,7 +4059,7 @@
         </w:tc>
         <w:tc>
           <w:tcPr>
-            <w:tcW w:w="1559" w:type="dxa"/>
+            <w:tcW w:w="1441" w:type="dxa"/>
             <w:tcBorders>
               <w:top w:val="nil"/>
               <w:left w:val="nil"/>
@@ -3844,7 +4084,7 @@
       <w:tr>
         <w:tc>
           <w:tcPr>
-            <w:tcW w:w="7083" w:type="dxa"/>
+            <w:tcW w:w="6513" w:type="dxa"/>
             <w:gridSpan w:val="3"/>
             <w:tcBorders>
               <w:top w:val="nil"/>
@@ -3907,8 +4147,8 @@
         </w:tc>
         <w:tc>
           <w:tcPr>
-            <w:tcW w:w="4252" w:type="dxa"/>
-            <w:gridSpan w:val="7"/>
+            <w:tcW w:w="4172" w:type="dxa"/>
+            <w:gridSpan w:val="6"/>
             <w:tcBorders>
               <w:top w:val="nil"/>
               <w:left w:val="nil"/>
@@ -3957,8 +4197,8 @@
       <w:tr>
         <w:tc>
           <w:tcPr>
-            <w:tcW w:w="11335" w:type="dxa"/>
-            <w:gridSpan w:val="10"/>
+            <w:tcW w:w="10685" w:type="dxa"/>
+            <w:gridSpan w:val="9"/>
             <w:tcBorders>
               <w:top w:val="nil"/>
               <w:left w:val="nil"/>
@@ -4069,7 +4309,6 @@
                 <w:bCs/>
                 <w:szCs w:val="22"/>
               </w:rPr>
-              <w:lastRenderedPageBreak/>
               <w:t>Accomplished applications including hooked ball-mitten toys and hairy objects, requiring precise path control to avoid defects and achieve intricate designs.</w:t>
             </w:r>
           </w:p>
@@ -4102,8 +4341,8 @@
       <w:tr>
         <w:tc>
           <w:tcPr>
-            <w:tcW w:w="9067" w:type="dxa"/>
-            <w:gridSpan w:val="8"/>
+            <w:tcW w:w="8593" w:type="dxa"/>
+            <w:gridSpan w:val="7"/>
             <w:tcBorders>
               <w:top w:val="nil"/>
               <w:left w:val="nil"/>
@@ -4127,7 +4366,6 @@
                 <w:b/>
                 <w:szCs w:val="22"/>
               </w:rPr>
-              <w:lastRenderedPageBreak/>
               <w:t>Over-the-Air-Computation Based Federated Learning Model Establishment</w:t>
             </w:r>
             <w:r>
@@ -4150,7 +4388,7 @@
         </w:tc>
         <w:tc>
           <w:tcPr>
-            <w:tcW w:w="2268" w:type="dxa"/>
+            <w:tcW w:w="2092" w:type="dxa"/>
             <w:gridSpan w:val="2"/>
             <w:tcBorders>
               <w:top w:val="nil"/>
@@ -4176,7 +4414,7 @@
       <w:tr>
         <w:tc>
           <w:tcPr>
-            <w:tcW w:w="7083" w:type="dxa"/>
+            <w:tcW w:w="6513" w:type="dxa"/>
             <w:gridSpan w:val="3"/>
             <w:tcBorders>
               <w:top w:val="nil"/>
@@ -4201,6 +4439,7 @@
                 <w:bCs/>
                 <w:szCs w:val="22"/>
               </w:rPr>
+              <w:lastRenderedPageBreak/>
               <w:t xml:space="preserve">Zhejiang University </w:t>
             </w:r>
             <w:r>
@@ -4247,8 +4486,8 @@
         </w:tc>
         <w:tc>
           <w:tcPr>
-            <w:tcW w:w="4252" w:type="dxa"/>
-            <w:gridSpan w:val="7"/>
+            <w:tcW w:w="4172" w:type="dxa"/>
+            <w:gridSpan w:val="6"/>
             <w:tcBorders>
               <w:top w:val="nil"/>
               <w:left w:val="nil"/>
@@ -4305,8 +4544,8 @@
       <w:tr>
         <w:tc>
           <w:tcPr>
-            <w:tcW w:w="11335" w:type="dxa"/>
-            <w:gridSpan w:val="10"/>
+            <w:tcW w:w="10685" w:type="dxa"/>
+            <w:gridSpan w:val="9"/>
             <w:tcBorders>
               <w:top w:val="nil"/>
               <w:left w:val="nil"/>
@@ -4487,7 +4726,7 @@
         </w:trPr>
         <w:tc>
           <w:tcPr>
-            <w:tcW w:w="7083" w:type="dxa"/>
+            <w:tcW w:w="6513" w:type="dxa"/>
             <w:gridSpan w:val="3"/>
             <w:tcBorders>
               <w:top w:val="nil"/>
@@ -4561,8 +4800,8 @@
         </w:tc>
         <w:tc>
           <w:tcPr>
-            <w:tcW w:w="4252" w:type="dxa"/>
-            <w:gridSpan w:val="7"/>
+            <w:tcW w:w="4172" w:type="dxa"/>
+            <w:gridSpan w:val="6"/>
             <w:tcBorders>
               <w:top w:val="nil"/>
               <w:left w:val="nil"/>
@@ -4590,7 +4829,7 @@
         </w:trPr>
         <w:tc>
           <w:tcPr>
-            <w:tcW w:w="6091" w:type="dxa"/>
+            <w:tcW w:w="5595" w:type="dxa"/>
             <w:gridSpan w:val="2"/>
             <w:tcBorders>
               <w:top w:val="single" w:sz="4" w:space="0" w:color="auto"/>
@@ -4620,7 +4859,7 @@
         </w:tc>
         <w:tc>
           <w:tcPr>
-            <w:tcW w:w="2551" w:type="dxa"/>
+            <w:tcW w:w="2375" w:type="dxa"/>
             <w:gridSpan w:val="4"/>
             <w:tcBorders>
               <w:top w:val="single" w:sz="4" w:space="0" w:color="auto"/>
@@ -4654,8 +4893,8 @@
         </w:tc>
         <w:tc>
           <w:tcPr>
-            <w:tcW w:w="2693" w:type="dxa"/>
-            <w:gridSpan w:val="4"/>
+            <w:tcW w:w="2715" w:type="dxa"/>
+            <w:gridSpan w:val="3"/>
             <w:tcBorders>
               <w:top w:val="single" w:sz="4" w:space="0" w:color="auto"/>
               <w:bottom w:val="nil"/>
@@ -4690,7 +4929,7 @@
         </w:trPr>
         <w:tc>
           <w:tcPr>
-            <w:tcW w:w="6091" w:type="dxa"/>
+            <w:tcW w:w="5595" w:type="dxa"/>
             <w:gridSpan w:val="2"/>
             <w:tcBorders>
               <w:top w:val="nil"/>
@@ -4728,7 +4967,7 @@
         </w:tc>
         <w:tc>
           <w:tcPr>
-            <w:tcW w:w="2551" w:type="dxa"/>
+            <w:tcW w:w="2375" w:type="dxa"/>
             <w:gridSpan w:val="4"/>
             <w:tcBorders>
               <w:top w:val="nil"/>
@@ -4762,8 +5001,8 @@
         </w:tc>
         <w:tc>
           <w:tcPr>
-            <w:tcW w:w="2693" w:type="dxa"/>
-            <w:gridSpan w:val="4"/>
+            <w:tcW w:w="2715" w:type="dxa"/>
+            <w:gridSpan w:val="3"/>
             <w:tcBorders>
               <w:top w:val="nil"/>
               <w:bottom w:val="nil"/>
@@ -4798,7 +5037,7 @@
         </w:trPr>
         <w:tc>
           <w:tcPr>
-            <w:tcW w:w="6091" w:type="dxa"/>
+            <w:tcW w:w="5595" w:type="dxa"/>
             <w:gridSpan w:val="2"/>
             <w:tcBorders>
               <w:top w:val="nil"/>
@@ -4828,7 +5067,7 @@
         </w:tc>
         <w:tc>
           <w:tcPr>
-            <w:tcW w:w="2551" w:type="dxa"/>
+            <w:tcW w:w="2375" w:type="dxa"/>
             <w:gridSpan w:val="4"/>
             <w:tcBorders>
               <w:top w:val="nil"/>
@@ -4862,8 +5101,8 @@
         </w:tc>
         <w:tc>
           <w:tcPr>
-            <w:tcW w:w="2693" w:type="dxa"/>
-            <w:gridSpan w:val="4"/>
+            <w:tcW w:w="2715" w:type="dxa"/>
+            <w:gridSpan w:val="3"/>
             <w:tcBorders>
               <w:top w:val="nil"/>
               <w:bottom w:val="nil"/>
@@ -4962,7 +5201,7 @@
         </w:trPr>
         <w:tc>
           <w:tcPr>
-            <w:tcW w:w="6091" w:type="dxa"/>
+            <w:tcW w:w="5595" w:type="dxa"/>
             <w:gridSpan w:val="2"/>
             <w:tcBorders>
               <w:top w:val="nil"/>
@@ -4992,7 +5231,7 @@
         </w:tc>
         <w:tc>
           <w:tcPr>
-            <w:tcW w:w="2551" w:type="dxa"/>
+            <w:tcW w:w="2375" w:type="dxa"/>
             <w:gridSpan w:val="4"/>
             <w:tcBorders>
               <w:top w:val="nil"/>
@@ -5026,8 +5265,8 @@
         </w:tc>
         <w:tc>
           <w:tcPr>
-            <w:tcW w:w="2693" w:type="dxa"/>
-            <w:gridSpan w:val="4"/>
+            <w:tcW w:w="2715" w:type="dxa"/>
+            <w:gridSpan w:val="3"/>
             <w:tcBorders>
               <w:top w:val="nil"/>
               <w:bottom w:val="nil"/>
@@ -5126,7 +5365,7 @@
         </w:trPr>
         <w:tc>
           <w:tcPr>
-            <w:tcW w:w="6091" w:type="dxa"/>
+            <w:tcW w:w="5595" w:type="dxa"/>
             <w:gridSpan w:val="2"/>
             <w:tcBorders>
               <w:top w:val="nil"/>
@@ -5158,7 +5397,7 @@
         </w:tc>
         <w:tc>
           <w:tcPr>
-            <w:tcW w:w="2551" w:type="dxa"/>
+            <w:tcW w:w="2375" w:type="dxa"/>
             <w:gridSpan w:val="4"/>
             <w:tcBorders>
               <w:top w:val="nil"/>
@@ -5192,8 +5431,8 @@
         </w:tc>
         <w:tc>
           <w:tcPr>
-            <w:tcW w:w="2693" w:type="dxa"/>
-            <w:gridSpan w:val="4"/>
+            <w:tcW w:w="2715" w:type="dxa"/>
+            <w:gridSpan w:val="3"/>
             <w:tcBorders>
               <w:top w:val="nil"/>
               <w:bottom w:val="nil"/>
@@ -5228,7 +5467,7 @@
         </w:trPr>
         <w:tc>
           <w:tcPr>
-            <w:tcW w:w="6091" w:type="dxa"/>
+            <w:tcW w:w="5595" w:type="dxa"/>
             <w:gridSpan w:val="2"/>
             <w:tcBorders>
               <w:top w:val="nil"/>
@@ -5258,7 +5497,7 @@
         </w:tc>
         <w:tc>
           <w:tcPr>
-            <w:tcW w:w="2551" w:type="dxa"/>
+            <w:tcW w:w="2375" w:type="dxa"/>
             <w:gridSpan w:val="4"/>
             <w:tcBorders>
               <w:top w:val="nil"/>
@@ -5292,8 +5531,8 @@
         </w:tc>
         <w:tc>
           <w:tcPr>
-            <w:tcW w:w="2693" w:type="dxa"/>
-            <w:gridSpan w:val="4"/>
+            <w:tcW w:w="2715" w:type="dxa"/>
+            <w:gridSpan w:val="3"/>
             <w:tcBorders>
               <w:top w:val="nil"/>
               <w:bottom w:val="nil"/>
@@ -5328,7 +5567,7 @@
         </w:trPr>
         <w:tc>
           <w:tcPr>
-            <w:tcW w:w="6091" w:type="dxa"/>
+            <w:tcW w:w="5595" w:type="dxa"/>
             <w:gridSpan w:val="2"/>
             <w:tcBorders>
               <w:top w:val="nil"/>
@@ -5374,7 +5613,7 @@
         </w:tc>
         <w:tc>
           <w:tcPr>
-            <w:tcW w:w="2551" w:type="dxa"/>
+            <w:tcW w:w="2375" w:type="dxa"/>
             <w:gridSpan w:val="4"/>
             <w:tcBorders>
               <w:top w:val="nil"/>
@@ -5408,8 +5647,8 @@
         </w:tc>
         <w:tc>
           <w:tcPr>
-            <w:tcW w:w="2693" w:type="dxa"/>
-            <w:gridSpan w:val="4"/>
+            <w:tcW w:w="2715" w:type="dxa"/>
+            <w:gridSpan w:val="3"/>
             <w:tcBorders>
               <w:top w:val="nil"/>
               <w:bottom w:val="nil"/>
@@ -5444,7 +5683,7 @@
         </w:trPr>
         <w:tc>
           <w:tcPr>
-            <w:tcW w:w="7083" w:type="dxa"/>
+            <w:tcW w:w="6513" w:type="dxa"/>
             <w:gridSpan w:val="3"/>
             <w:tcBorders>
               <w:top w:val="nil"/>
@@ -5491,8 +5730,8 @@
         </w:tc>
         <w:tc>
           <w:tcPr>
-            <w:tcW w:w="4252" w:type="dxa"/>
-            <w:gridSpan w:val="7"/>
+            <w:tcW w:w="4172" w:type="dxa"/>
+            <w:gridSpan w:val="6"/>
             <w:tcBorders>
               <w:top w:val="nil"/>
               <w:left w:val="nil"/>
@@ -5517,8 +5756,8 @@
       <w:tr>
         <w:tc>
           <w:tcPr>
-            <w:tcW w:w="11335" w:type="dxa"/>
-            <w:gridSpan w:val="10"/>
+            <w:tcW w:w="10685" w:type="dxa"/>
+            <w:gridSpan w:val="9"/>
             <w:tcBorders>
               <w:top w:val="single" w:sz="4" w:space="0" w:color="auto"/>
               <w:left w:val="nil"/>
@@ -5606,23 +5845,13 @@
                 <w:szCs w:val="22"/>
               </w:rPr>
             </w:pPr>
-            <w:proofErr w:type="gramStart"/>
-            <w:r>
-              <w:rPr>
-                <w:rFonts w:ascii="Times New Roman" w:eastAsiaTheme="minorEastAsia" w:hAnsi="Times New Roman" w:cs="Times New Roman"/>
-                <w:bCs/>
-                <w:szCs w:val="22"/>
-              </w:rPr>
-              <w:t>Hardwares</w:t>
-            </w:r>
-            <w:proofErr w:type="gramEnd"/>
-            <w:r>
-              <w:rPr>
-                <w:rFonts w:ascii="Times New Roman" w:eastAsiaTheme="minorEastAsia" w:hAnsi="Times New Roman" w:cs="Times New Roman"/>
-                <w:bCs/>
-                <w:szCs w:val="22"/>
-              </w:rPr>
-              <w:t xml:space="preserve">: </w:t>
+            <w:r>
+              <w:rPr>
+                <w:rFonts w:ascii="Times New Roman" w:eastAsiaTheme="minorEastAsia" w:hAnsi="Times New Roman" w:cs="Times New Roman"/>
+                <w:bCs/>
+                <w:szCs w:val="22"/>
+              </w:rPr>
+              <w:t xml:space="preserve">Hardwares: </w:t>
             </w:r>
             <w:r>
               <w:rPr>

</xml_diff>

<commit_message>
Deploying to gh-pages from @ Yonghonghui/Yonghonghui.github.io@9b4112f399976d3c532cdd8b051d3b814138973c 🚀
</commit_message>
<xml_diff>
--- a/assets/pdf/CV-Yanghonghui Chen.docx
+++ b/assets/pdf/CV-Yanghonghui Chen.docx
@@ -6,7 +6,7 @@
       <w:tblPr>
         <w:tblStyle w:val="TableGrid"/>
         <w:tblpPr w:leftFromText="180" w:rightFromText="180" w:horzAnchor="margin" w:tblpXSpec="center" w:tblpY="-392"/>
-        <w:tblW w:w="0" w:type="auto"/>
+        <w:tblW w:w="10685" w:type="dxa"/>
         <w:tblBorders>
           <w:top w:val="dotted" w:sz="4" w:space="0" w:color="auto"/>
           <w:left w:val="dotted" w:sz="4" w:space="0" w:color="auto"/>
@@ -24,16 +24,15 @@
         <w:gridCol w:w="1226"/>
         <w:gridCol w:w="94"/>
         <w:gridCol w:w="137"/>
-        <w:gridCol w:w="271"/>
-        <w:gridCol w:w="135"/>
+        <w:gridCol w:w="623"/>
         <w:gridCol w:w="651"/>
-        <w:gridCol w:w="1439"/>
+        <w:gridCol w:w="1441"/>
       </w:tblGrid>
       <w:tr>
         <w:tc>
           <w:tcPr>
-            <w:tcW w:w="11335" w:type="dxa"/>
-            <w:gridSpan w:val="10"/>
+            <w:tcW w:w="10685" w:type="dxa"/>
+            <w:gridSpan w:val="9"/>
             <w:tcBorders>
               <w:top w:val="nil"/>
               <w:left w:val="nil"/>
@@ -214,8 +213,8 @@
         </w:trPr>
         <w:tc>
           <w:tcPr>
-            <w:tcW w:w="11335" w:type="dxa"/>
-            <w:gridSpan w:val="10"/>
+            <w:tcW w:w="10685" w:type="dxa"/>
+            <w:gridSpan w:val="9"/>
             <w:tcBorders>
               <w:top w:val="nil"/>
               <w:left w:val="nil"/>
@@ -251,7 +250,7 @@
       <w:tr>
         <w:tc>
           <w:tcPr>
-            <w:tcW w:w="7083" w:type="dxa"/>
+            <w:tcW w:w="6513" w:type="dxa"/>
             <w:gridSpan w:val="3"/>
             <w:tcBorders>
               <w:top w:val="nil"/>
@@ -282,8 +281,8 @@
         </w:tc>
         <w:tc>
           <w:tcPr>
-            <w:tcW w:w="4252" w:type="dxa"/>
-            <w:gridSpan w:val="7"/>
+            <w:tcW w:w="4172" w:type="dxa"/>
+            <w:gridSpan w:val="6"/>
             <w:tcBorders>
               <w:top w:val="nil"/>
               <w:left w:val="nil"/>
@@ -324,7 +323,7 @@
       <w:tr>
         <w:tc>
           <w:tcPr>
-            <w:tcW w:w="7083" w:type="dxa"/>
+            <w:tcW w:w="6513" w:type="dxa"/>
             <w:gridSpan w:val="3"/>
             <w:tcBorders>
               <w:top w:val="nil"/>
@@ -379,8 +378,8 @@
         </w:tc>
         <w:tc>
           <w:tcPr>
-            <w:tcW w:w="4252" w:type="dxa"/>
-            <w:gridSpan w:val="7"/>
+            <w:tcW w:w="4172" w:type="dxa"/>
+            <w:gridSpan w:val="6"/>
             <w:tcBorders>
               <w:top w:val="nil"/>
               <w:left w:val="nil"/>
@@ -448,7 +447,7 @@
         </w:trPr>
         <w:tc>
           <w:tcPr>
-            <w:tcW w:w="7083" w:type="dxa"/>
+            <w:tcW w:w="6513" w:type="dxa"/>
             <w:gridSpan w:val="3"/>
             <w:tcBorders>
               <w:top w:val="nil"/>
@@ -479,8 +478,8 @@
         </w:tc>
         <w:tc>
           <w:tcPr>
-            <w:tcW w:w="4252" w:type="dxa"/>
-            <w:gridSpan w:val="7"/>
+            <w:tcW w:w="4172" w:type="dxa"/>
+            <w:gridSpan w:val="6"/>
             <w:tcBorders>
               <w:top w:val="nil"/>
               <w:left w:val="nil"/>
@@ -513,7 +512,7 @@
       <w:tr>
         <w:tc>
           <w:tcPr>
-            <w:tcW w:w="7083" w:type="dxa"/>
+            <w:tcW w:w="6513" w:type="dxa"/>
             <w:gridSpan w:val="3"/>
             <w:tcBorders>
               <w:top w:val="nil"/>
@@ -560,8 +559,8 @@
         </w:tc>
         <w:tc>
           <w:tcPr>
-            <w:tcW w:w="4252" w:type="dxa"/>
-            <w:gridSpan w:val="7"/>
+            <w:tcW w:w="4172" w:type="dxa"/>
+            <w:gridSpan w:val="6"/>
             <w:tcBorders>
               <w:top w:val="nil"/>
               <w:left w:val="nil"/>
@@ -602,7 +601,7 @@
       <w:tr>
         <w:tc>
           <w:tcPr>
-            <w:tcW w:w="7083" w:type="dxa"/>
+            <w:tcW w:w="6513" w:type="dxa"/>
             <w:gridSpan w:val="3"/>
             <w:tcBorders>
               <w:top w:val="nil"/>
@@ -633,8 +632,8 @@
         </w:tc>
         <w:tc>
           <w:tcPr>
-            <w:tcW w:w="4252" w:type="dxa"/>
-            <w:gridSpan w:val="7"/>
+            <w:tcW w:w="4172" w:type="dxa"/>
+            <w:gridSpan w:val="6"/>
             <w:tcBorders>
               <w:top w:val="nil"/>
               <w:left w:val="nil"/>
@@ -683,7 +682,7 @@
       <w:tr>
         <w:tc>
           <w:tcPr>
-            <w:tcW w:w="7083" w:type="dxa"/>
+            <w:tcW w:w="6513" w:type="dxa"/>
             <w:gridSpan w:val="3"/>
             <w:tcBorders>
               <w:top w:val="nil"/>
@@ -746,8 +745,8 @@
         </w:tc>
         <w:tc>
           <w:tcPr>
-            <w:tcW w:w="4252" w:type="dxa"/>
-            <w:gridSpan w:val="7"/>
+            <w:tcW w:w="4172" w:type="dxa"/>
+            <w:gridSpan w:val="6"/>
             <w:tcBorders>
               <w:top w:val="nil"/>
               <w:left w:val="nil"/>
@@ -788,8 +787,8 @@
       <w:tr>
         <w:tc>
           <w:tcPr>
-            <w:tcW w:w="11335" w:type="dxa"/>
-            <w:gridSpan w:val="10"/>
+            <w:tcW w:w="10685" w:type="dxa"/>
+            <w:gridSpan w:val="9"/>
             <w:tcBorders>
               <w:top w:val="nil"/>
               <w:left w:val="nil"/>
@@ -1056,8 +1055,8 @@
       <w:tr>
         <w:tc>
           <w:tcPr>
-            <w:tcW w:w="11335" w:type="dxa"/>
-            <w:gridSpan w:val="10"/>
+            <w:tcW w:w="10685" w:type="dxa"/>
+            <w:gridSpan w:val="9"/>
             <w:tcBorders>
               <w:top w:val="nil"/>
               <w:left w:val="nil"/>
@@ -1084,7 +1083,7 @@
         </w:trPr>
         <w:tc>
           <w:tcPr>
-            <w:tcW w:w="7083" w:type="dxa"/>
+            <w:tcW w:w="6513" w:type="dxa"/>
             <w:gridSpan w:val="3"/>
             <w:tcBorders>
               <w:top w:val="nil"/>
@@ -1106,20 +1105,30 @@
             </w:pPr>
             <w:r>
               <w:rPr>
-                <w:rFonts w:ascii="Times New Roman" w:eastAsiaTheme="minorEastAsia" w:hAnsi="Times New Roman" w:cs="Times New Roman"/>
+                <w:rFonts w:ascii="Times New Roman" w:eastAsiaTheme="minorEastAsia" w:hAnsi="Times New Roman" w:cs="Times New Roman" w:hint="eastAsia"/>
                 <w:b/>
                 <w:sz w:val="28"/>
                 <w:szCs w:val="28"/>
                 <w:shd w:val="pct15" w:color="auto" w:fill="FFFFFF"/>
               </w:rPr>
-              <w:t>RESEARCH EXPERIENCES</w:t>
-            </w:r>
-          </w:p>
-        </w:tc>
-        <w:tc>
-          <w:tcPr>
-            <w:tcW w:w="4252" w:type="dxa"/>
-            <w:gridSpan w:val="7"/>
+              <w:t xml:space="preserve">PROJECT </w:t>
+            </w:r>
+            <w:r>
+              <w:rPr>
+                <w:rFonts w:ascii="Times New Roman" w:eastAsiaTheme="minorEastAsia" w:hAnsi="Times New Roman" w:cs="Times New Roman"/>
+                <w:b/>
+                <w:sz w:val="28"/>
+                <w:szCs w:val="28"/>
+                <w:shd w:val="pct15" w:color="auto" w:fill="FFFFFF"/>
+              </w:rPr>
+              <w:t>EXPERIENCES</w:t>
+            </w:r>
+          </w:p>
+        </w:tc>
+        <w:tc>
+          <w:tcPr>
+            <w:tcW w:w="4172" w:type="dxa"/>
+            <w:gridSpan w:val="6"/>
             <w:tcBorders>
               <w:top w:val="nil"/>
               <w:left w:val="nil"/>
@@ -1144,8 +1153,8 @@
       <w:tr>
         <w:tc>
           <w:tcPr>
-            <w:tcW w:w="11335" w:type="dxa"/>
-            <w:gridSpan w:val="10"/>
+            <w:tcW w:w="10685" w:type="dxa"/>
+            <w:gridSpan w:val="9"/>
             <w:tcBorders>
               <w:top w:val="single" w:sz="4" w:space="0" w:color="auto"/>
               <w:left w:val="nil"/>
@@ -1177,7 +1186,7 @@
       <w:tr>
         <w:tc>
           <w:tcPr>
-            <w:tcW w:w="5667" w:type="dxa"/>
+            <w:tcW w:w="5214" w:type="dxa"/>
             <w:tcBorders>
               <w:top w:val="nil"/>
               <w:left w:val="nil"/>
@@ -1203,13 +1212,23 @@
               </w:rPr>
               <w:t xml:space="preserve">Senior Design (Advisor: Prof. </w:t>
             </w:r>
-            <w:r>
-              <w:rPr>
-                <w:rFonts w:ascii="Times New Roman" w:eastAsiaTheme="minorEastAsia" w:hAnsi="Times New Roman" w:cs="Times New Roman"/>
-                <w:bCs/>
-                <w:szCs w:val="22"/>
-              </w:rPr>
-              <w:t>Oleskiy Penkov</w:t>
+            <w:proofErr w:type="spellStart"/>
+            <w:r>
+              <w:rPr>
+                <w:rFonts w:ascii="Times New Roman" w:eastAsiaTheme="minorEastAsia" w:hAnsi="Times New Roman" w:cs="Times New Roman"/>
+                <w:bCs/>
+                <w:szCs w:val="22"/>
+              </w:rPr>
+              <w:t>Oleskiy</w:t>
+            </w:r>
+            <w:proofErr w:type="spellEnd"/>
+            <w:r>
+              <w:rPr>
+                <w:rFonts w:ascii="Times New Roman" w:eastAsiaTheme="minorEastAsia" w:hAnsi="Times New Roman" w:cs="Times New Roman"/>
+                <w:bCs/>
+                <w:szCs w:val="22"/>
+              </w:rPr>
+              <w:t xml:space="preserve"> Penkov</w:t>
             </w:r>
             <w:r>
               <w:rPr>
@@ -1223,8 +1242,8 @@
         </w:tc>
         <w:tc>
           <w:tcPr>
-            <w:tcW w:w="5668" w:type="dxa"/>
-            <w:gridSpan w:val="9"/>
+            <w:tcW w:w="5471" w:type="dxa"/>
+            <w:gridSpan w:val="8"/>
             <w:tcBorders>
               <w:top w:val="nil"/>
               <w:left w:val="nil"/>
@@ -1248,7 +1267,15 @@
                 <w:bCs/>
                 <w:szCs w:val="22"/>
               </w:rPr>
-              <w:t xml:space="preserve">                                                        </w:t>
+              <w:t xml:space="preserve">                                                </w:t>
+            </w:r>
+            <w:r>
+              <w:rPr>
+                <w:rFonts w:ascii="Times New Roman" w:eastAsiaTheme="minorEastAsia" w:hAnsi="Times New Roman" w:cs="Times New Roman" w:hint="eastAsia"/>
+                <w:bCs/>
+                <w:szCs w:val="22"/>
+              </w:rPr>
+              <w:t xml:space="preserve">    </w:t>
             </w:r>
             <w:r>
               <w:rPr>
@@ -1272,7 +1299,23 @@
                 <w:bCs/>
                 <w:szCs w:val="22"/>
               </w:rPr>
-              <w:t xml:space="preserve"> - May 2025</w:t>
+              <w:t xml:space="preserve"> - May</w:t>
+            </w:r>
+            <w:r>
+              <w:rPr>
+                <w:rFonts w:ascii="Times New Roman" w:eastAsiaTheme="minorEastAsia" w:hAnsi="Times New Roman" w:cs="Times New Roman" w:hint="eastAsia"/>
+                <w:bCs/>
+                <w:szCs w:val="22"/>
+              </w:rPr>
+              <w:t xml:space="preserve"> </w:t>
+            </w:r>
+            <w:r>
+              <w:rPr>
+                <w:rFonts w:ascii="Times New Roman" w:eastAsiaTheme="minorEastAsia" w:hAnsi="Times New Roman" w:cs="Times New Roman"/>
+                <w:bCs/>
+                <w:szCs w:val="22"/>
+              </w:rPr>
+              <w:t>2025</w:t>
             </w:r>
           </w:p>
         </w:tc>
@@ -1280,8 +1323,8 @@
       <w:tr>
         <w:tc>
           <w:tcPr>
-            <w:tcW w:w="11335" w:type="dxa"/>
-            <w:gridSpan w:val="10"/>
+            <w:tcW w:w="10685" w:type="dxa"/>
+            <w:gridSpan w:val="9"/>
             <w:tcBorders>
               <w:top w:val="nil"/>
               <w:left w:val="nil"/>
@@ -1435,8 +1478,8 @@
       <w:tr>
         <w:tc>
           <w:tcPr>
-            <w:tcW w:w="11335" w:type="dxa"/>
-            <w:gridSpan w:val="10"/>
+            <w:tcW w:w="10685" w:type="dxa"/>
+            <w:gridSpan w:val="9"/>
             <w:tcBorders>
               <w:top w:val="nil"/>
               <w:left w:val="nil"/>
@@ -1484,7 +1527,7 @@
       <w:tr>
         <w:tc>
           <w:tcPr>
-            <w:tcW w:w="8411" w:type="dxa"/>
+            <w:tcW w:w="7739" w:type="dxa"/>
             <w:gridSpan w:val="4"/>
             <w:tcBorders>
               <w:top w:val="nil"/>
@@ -1515,8 +1558,8 @@
         </w:tc>
         <w:tc>
           <w:tcPr>
-            <w:tcW w:w="2924" w:type="dxa"/>
-            <w:gridSpan w:val="6"/>
+            <w:tcW w:w="2946" w:type="dxa"/>
+            <w:gridSpan w:val="5"/>
             <w:tcBorders>
               <w:top w:val="nil"/>
               <w:left w:val="nil"/>
@@ -1540,7 +1583,23 @@
                 <w:bCs/>
                 <w:szCs w:val="22"/>
               </w:rPr>
-              <w:t xml:space="preserve">       </w:t>
+              <w:t xml:space="preserve">  </w:t>
+            </w:r>
+            <w:r>
+              <w:rPr>
+                <w:rFonts w:ascii="Times New Roman" w:eastAsiaTheme="minorEastAsia" w:hAnsi="Times New Roman" w:cs="Times New Roman" w:hint="eastAsia"/>
+                <w:bCs/>
+                <w:szCs w:val="22"/>
+              </w:rPr>
+              <w:t xml:space="preserve"> </w:t>
+            </w:r>
+            <w:r>
+              <w:rPr>
+                <w:rFonts w:ascii="Times New Roman" w:eastAsiaTheme="minorEastAsia" w:hAnsi="Times New Roman" w:cs="Times New Roman" w:hint="eastAsia"/>
+                <w:bCs/>
+                <w:szCs w:val="22"/>
+              </w:rPr>
+              <w:t xml:space="preserve">    </w:t>
             </w:r>
             <w:r>
               <w:rPr>
@@ -1572,8 +1631,8 @@
       <w:tr>
         <w:tc>
           <w:tcPr>
-            <w:tcW w:w="11335" w:type="dxa"/>
-            <w:gridSpan w:val="10"/>
+            <w:tcW w:w="10685" w:type="dxa"/>
+            <w:gridSpan w:val="9"/>
             <w:tcBorders>
               <w:top w:val="nil"/>
               <w:left w:val="nil"/>
@@ -1639,7 +1698,31 @@
                 <w:sz w:val="20"/>
                 <w:szCs w:val="20"/>
               </w:rPr>
-              <w:t>Federated Learning, Personalized FL (pFedMe), EEG, Seizure Prediction</w:t>
+              <w:t>Federated Learning, Personalized FL (</w:t>
+            </w:r>
+            <w:proofErr w:type="spellStart"/>
+            <w:r>
+              <w:rPr>
+                <w:rFonts w:ascii="Times New Roman" w:eastAsiaTheme="minorEastAsia" w:hAnsi="Times New Roman" w:cs="Times New Roman"/>
+                <w:bCs/>
+                <w:i/>
+                <w:iCs/>
+                <w:sz w:val="20"/>
+                <w:szCs w:val="20"/>
+              </w:rPr>
+              <w:t>pFedMe</w:t>
+            </w:r>
+            <w:proofErr w:type="spellEnd"/>
+            <w:r>
+              <w:rPr>
+                <w:rFonts w:ascii="Times New Roman" w:eastAsiaTheme="minorEastAsia" w:hAnsi="Times New Roman" w:cs="Times New Roman"/>
+                <w:bCs/>
+                <w:i/>
+                <w:iCs/>
+                <w:sz w:val="20"/>
+                <w:szCs w:val="20"/>
+              </w:rPr>
+              <w:t>), EEG, Seizure Prediction</w:t>
             </w:r>
           </w:p>
           <w:p>
@@ -1663,7 +1746,25 @@
                 <w:bCs/>
                 <w:szCs w:val="22"/>
               </w:rPr>
-              <w:t>Designed and implemented a privacy-preserving pipeline for seizure prediction, processing EEG signals into Pearson Correlation Coefficient (PCC) matrices and training a CNN classifier using four distinct paradigms: Local, Centralized, FedAvg, and pFedMe.</w:t>
+              <w:t xml:space="preserve">Designed and implemented a privacy-preserving pipeline for seizure prediction, processing EEG signals into Pearson Correlation Coefficient (PCC) matrices and training a CNN classifier using four distinct paradigms: Local, Centralized, FedAvg, and </w:t>
+            </w:r>
+            <w:proofErr w:type="spellStart"/>
+            <w:r>
+              <w:rPr>
+                <w:rFonts w:ascii="Times New Roman" w:eastAsiaTheme="minorEastAsia" w:hAnsi="Times New Roman" w:cs="Times New Roman"/>
+                <w:bCs/>
+                <w:szCs w:val="22"/>
+              </w:rPr>
+              <w:t>pFedMe</w:t>
+            </w:r>
+            <w:proofErr w:type="spellEnd"/>
+            <w:r>
+              <w:rPr>
+                <w:rFonts w:ascii="Times New Roman" w:eastAsiaTheme="minorEastAsia" w:hAnsi="Times New Roman" w:cs="Times New Roman"/>
+                <w:bCs/>
+                <w:szCs w:val="22"/>
+              </w:rPr>
+              <w:t>.</w:t>
             </w:r>
           </w:p>
           <w:p>
@@ -1687,7 +1788,25 @@
                 <w:bCs/>
                 <w:szCs w:val="22"/>
               </w:rPr>
-              <w:t>Demonstrated that standard FedAvg underperforms due to client data heterogeneity and severe class imbalance, while personalized pFedMe significantly improves average sensitivity and F1-scores over FedAvg by adapting to unique patient data.</w:t>
+              <w:t xml:space="preserve">Demonstrated that standard FedAvg underperforms due to client data heterogeneity and severe class imbalance, while personalized </w:t>
+            </w:r>
+            <w:proofErr w:type="spellStart"/>
+            <w:r>
+              <w:rPr>
+                <w:rFonts w:ascii="Times New Roman" w:eastAsiaTheme="minorEastAsia" w:hAnsi="Times New Roman" w:cs="Times New Roman"/>
+                <w:bCs/>
+                <w:szCs w:val="22"/>
+              </w:rPr>
+              <w:t>pFedMe</w:t>
+            </w:r>
+            <w:proofErr w:type="spellEnd"/>
+            <w:r>
+              <w:rPr>
+                <w:rFonts w:ascii="Times New Roman" w:eastAsiaTheme="minorEastAsia" w:hAnsi="Times New Roman" w:cs="Times New Roman"/>
+                <w:bCs/>
+                <w:szCs w:val="22"/>
+              </w:rPr>
+              <w:t xml:space="preserve"> significantly improves average sensitivity and F1-scores over FedAvg by adapting to unique patient data.</w:t>
             </w:r>
           </w:p>
           <w:p>
@@ -1711,7 +1830,25 @@
                 <w:bCs/>
                 <w:szCs w:val="22"/>
               </w:rPr>
-              <w:t>Conducted a detailed hyperparameter analysis of the pFedMe personalization weight (λ), revealing that smaller λ values are critical for minority class detection (sensitivity), whereas larger values cause performance to collapse by forcing adherence to a globally biased model.</w:t>
+              <w:t xml:space="preserve">Conducted a detailed hyperparameter analysis of the </w:t>
+            </w:r>
+            <w:proofErr w:type="spellStart"/>
+            <w:r>
+              <w:rPr>
+                <w:rFonts w:ascii="Times New Roman" w:eastAsiaTheme="minorEastAsia" w:hAnsi="Times New Roman" w:cs="Times New Roman"/>
+                <w:bCs/>
+                <w:szCs w:val="22"/>
+              </w:rPr>
+              <w:t>pFedMe</w:t>
+            </w:r>
+            <w:proofErr w:type="spellEnd"/>
+            <w:r>
+              <w:rPr>
+                <w:rFonts w:ascii="Times New Roman" w:eastAsiaTheme="minorEastAsia" w:hAnsi="Times New Roman" w:cs="Times New Roman"/>
+                <w:bCs/>
+                <w:szCs w:val="22"/>
+              </w:rPr>
+              <w:t xml:space="preserve"> personalization weight (λ), revealing that smaller λ values are critical for minority class detection (sensitivity), whereas larger values cause performance to collapse by forcing adherence to a globally biased model.</w:t>
             </w:r>
           </w:p>
         </w:tc>
@@ -1719,7 +1856,7 @@
       <w:tr>
         <w:tc>
           <w:tcPr>
-            <w:tcW w:w="8411" w:type="dxa"/>
+            <w:tcW w:w="7739" w:type="dxa"/>
             <w:gridSpan w:val="4"/>
             <w:tcBorders>
               <w:top w:val="nil"/>
@@ -1750,8 +1887,8 @@
         </w:tc>
         <w:tc>
           <w:tcPr>
-            <w:tcW w:w="2924" w:type="dxa"/>
-            <w:gridSpan w:val="6"/>
+            <w:tcW w:w="2946" w:type="dxa"/>
+            <w:gridSpan w:val="5"/>
             <w:tcBorders>
               <w:top w:val="nil"/>
               <w:left w:val="nil"/>
@@ -1775,7 +1912,7 @@
       <w:tr>
         <w:tc>
           <w:tcPr>
-            <w:tcW w:w="7083" w:type="dxa"/>
+            <w:tcW w:w="6513" w:type="dxa"/>
             <w:gridSpan w:val="3"/>
             <w:tcBorders>
               <w:top w:val="nil"/>
@@ -1822,8 +1959,8 @@
         </w:tc>
         <w:tc>
           <w:tcPr>
-            <w:tcW w:w="4252" w:type="dxa"/>
-            <w:gridSpan w:val="7"/>
+            <w:tcW w:w="4172" w:type="dxa"/>
+            <w:gridSpan w:val="6"/>
             <w:tcBorders>
               <w:top w:val="nil"/>
               <w:left w:val="nil"/>
@@ -1847,7 +1984,23 @@
                 <w:bCs/>
                 <w:szCs w:val="22"/>
               </w:rPr>
-              <w:t xml:space="preserve">                        </w:t>
+              <w:t xml:space="preserve">                 </w:t>
+            </w:r>
+            <w:r>
+              <w:rPr>
+                <w:rFonts w:ascii="Times New Roman" w:eastAsiaTheme="minorEastAsia" w:hAnsi="Times New Roman" w:cs="Times New Roman" w:hint="eastAsia"/>
+                <w:bCs/>
+                <w:szCs w:val="22"/>
+              </w:rPr>
+              <w:t xml:space="preserve"> </w:t>
+            </w:r>
+            <w:r>
+              <w:rPr>
+                <w:rFonts w:ascii="Times New Roman" w:eastAsiaTheme="minorEastAsia" w:hAnsi="Times New Roman" w:cs="Times New Roman" w:hint="eastAsia"/>
+                <w:bCs/>
+                <w:szCs w:val="22"/>
+              </w:rPr>
+              <w:t xml:space="preserve">    </w:t>
             </w:r>
             <w:r>
               <w:rPr>
@@ -1887,8 +2040,8 @@
       <w:tr>
         <w:tc>
           <w:tcPr>
-            <w:tcW w:w="11335" w:type="dxa"/>
-            <w:gridSpan w:val="10"/>
+            <w:tcW w:w="10685" w:type="dxa"/>
+            <w:gridSpan w:val="9"/>
             <w:tcBorders>
               <w:top w:val="nil"/>
               <w:left w:val="nil"/>
@@ -2021,7 +2174,6 @@
                 <w:bCs/>
                 <w:szCs w:val="22"/>
               </w:rPr>
-              <w:lastRenderedPageBreak/>
               <w:t>Implemented a GPU-based forward convolution with a structured Prolog-Kernel-Epilog approach, ensuring memory management, convolution computation, and output transfer, while matching CPU implementation correctness and optimizing performance using Nsight profiling tools.</w:t>
             </w:r>
           </w:p>
@@ -2046,6 +2198,7 @@
                 <w:bCs/>
                 <w:szCs w:val="22"/>
               </w:rPr>
+              <w:lastRenderedPageBreak/>
               <w:t>Applied advanced GPU programming techniques</w:t>
             </w:r>
             <w:r>
@@ -2062,25 +2215,7 @@
                 <w:bCs/>
                 <w:szCs w:val="22"/>
               </w:rPr>
-              <w:t xml:space="preserve">, including streams, GEMM kernels, and kernel fusion, to achieve a target inference time </w:t>
-            </w:r>
-            <w:proofErr w:type="gramStart"/>
-            <w:r>
-              <w:rPr>
-                <w:rFonts w:ascii="Times New Roman" w:eastAsiaTheme="minorEastAsia" w:hAnsi="Times New Roman" w:cs="Times New Roman"/>
-                <w:bCs/>
-                <w:szCs w:val="22"/>
-              </w:rPr>
-              <w:t>of ≤80ms for</w:t>
-            </w:r>
-            <w:proofErr w:type="gramEnd"/>
-            <w:r>
-              <w:rPr>
-                <w:rFonts w:ascii="Times New Roman" w:eastAsiaTheme="minorEastAsia" w:hAnsi="Times New Roman" w:cs="Times New Roman"/>
-                <w:bCs/>
-                <w:szCs w:val="22"/>
-              </w:rPr>
-              <w:t xml:space="preserve"> 10,000 images from the Fashion MNIST dataset.</w:t>
+              <w:t>, including streams, GEMM kernels, and kernel fusion, to achieve a target inference time of ≤80ms for 10,000 images from the Fashion MNIST dataset.</w:t>
             </w:r>
           </w:p>
         </w:tc>
@@ -2088,7 +2223,7 @@
       <w:tr>
         <w:tc>
           <w:tcPr>
-            <w:tcW w:w="8411" w:type="dxa"/>
+            <w:tcW w:w="7739" w:type="dxa"/>
             <w:gridSpan w:val="4"/>
             <w:tcBorders>
               <w:top w:val="nil"/>
@@ -2120,8 +2255,8 @@
         </w:tc>
         <w:tc>
           <w:tcPr>
-            <w:tcW w:w="2924" w:type="dxa"/>
-            <w:gridSpan w:val="6"/>
+            <w:tcW w:w="2946" w:type="dxa"/>
+            <w:gridSpan w:val="5"/>
             <w:tcBorders>
               <w:top w:val="nil"/>
               <w:left w:val="nil"/>
@@ -2145,7 +2280,7 @@
       <w:tr>
         <w:tc>
           <w:tcPr>
-            <w:tcW w:w="7083" w:type="dxa"/>
+            <w:tcW w:w="6513" w:type="dxa"/>
             <w:gridSpan w:val="3"/>
             <w:tcBorders>
               <w:top w:val="nil"/>
@@ -2218,8 +2353,8 @@
         </w:tc>
         <w:tc>
           <w:tcPr>
-            <w:tcW w:w="4252" w:type="dxa"/>
-            <w:gridSpan w:val="7"/>
+            <w:tcW w:w="4172" w:type="dxa"/>
+            <w:gridSpan w:val="6"/>
             <w:tcBorders>
               <w:top w:val="nil"/>
               <w:left w:val="nil"/>
@@ -2268,8 +2403,8 @@
       <w:tr>
         <w:tc>
           <w:tcPr>
-            <w:tcW w:w="11335" w:type="dxa"/>
-            <w:gridSpan w:val="10"/>
+            <w:tcW w:w="10685" w:type="dxa"/>
+            <w:gridSpan w:val="9"/>
             <w:tcBorders>
               <w:top w:val="nil"/>
               <w:left w:val="nil"/>
@@ -2424,7 +2559,25 @@
                 <w:bCs/>
                 <w:szCs w:val="22"/>
               </w:rPr>
-              <w:t>Contributed to combining the BCIC IV IIa and the P300 RSVP datasets and designing an</w:t>
+              <w:t xml:space="preserve">Contributed to combining the BCIC IV </w:t>
+            </w:r>
+            <w:proofErr w:type="spellStart"/>
+            <w:r>
+              <w:rPr>
+                <w:rFonts w:ascii="Times New Roman" w:eastAsiaTheme="minorEastAsia" w:hAnsi="Times New Roman" w:cs="Times New Roman"/>
+                <w:bCs/>
+                <w:szCs w:val="22"/>
+              </w:rPr>
+              <w:t>IIa</w:t>
+            </w:r>
+            <w:proofErr w:type="spellEnd"/>
+            <w:r>
+              <w:rPr>
+                <w:rFonts w:ascii="Times New Roman" w:eastAsiaTheme="minorEastAsia" w:hAnsi="Times New Roman" w:cs="Times New Roman"/>
+                <w:bCs/>
+                <w:szCs w:val="22"/>
+              </w:rPr>
+              <w:t xml:space="preserve"> and the P300 RSVP datasets and designing an</w:t>
             </w:r>
             <w:r>
               <w:rPr>
@@ -2488,8 +2641,8 @@
       <w:tr>
         <w:tc>
           <w:tcPr>
-            <w:tcW w:w="9776" w:type="dxa"/>
-            <w:gridSpan w:val="9"/>
+            <w:tcW w:w="9244" w:type="dxa"/>
+            <w:gridSpan w:val="8"/>
             <w:tcBorders>
               <w:top w:val="nil"/>
               <w:left w:val="nil"/>
@@ -2543,7 +2696,7 @@
         </w:tc>
         <w:tc>
           <w:tcPr>
-            <w:tcW w:w="1559" w:type="dxa"/>
+            <w:tcW w:w="1441" w:type="dxa"/>
             <w:tcBorders>
               <w:top w:val="nil"/>
               <w:left w:val="nil"/>
@@ -2568,7 +2721,7 @@
       <w:tr>
         <w:tc>
           <w:tcPr>
-            <w:tcW w:w="8642" w:type="dxa"/>
+            <w:tcW w:w="7970" w:type="dxa"/>
             <w:gridSpan w:val="6"/>
             <w:tcBorders>
               <w:top w:val="nil"/>
@@ -2614,8 +2767,8 @@
         </w:tc>
         <w:tc>
           <w:tcPr>
-            <w:tcW w:w="2693" w:type="dxa"/>
-            <w:gridSpan w:val="4"/>
+            <w:tcW w:w="2715" w:type="dxa"/>
+            <w:gridSpan w:val="3"/>
             <w:tcBorders>
               <w:top w:val="nil"/>
               <w:bottom w:val="nil"/>
@@ -2647,8 +2800,8 @@
       <w:tr>
         <w:tc>
           <w:tcPr>
-            <w:tcW w:w="11335" w:type="dxa"/>
-            <w:gridSpan w:val="10"/>
+            <w:tcW w:w="10685" w:type="dxa"/>
+            <w:gridSpan w:val="9"/>
             <w:tcBorders>
               <w:top w:val="nil"/>
               <w:left w:val="nil"/>
@@ -2874,7 +3027,43 @@
                 <w:bCs/>
                 <w:szCs w:val="22"/>
               </w:rPr>
-              <w:t>Implemented MTCNN with ResNet and dlib-based face recognition, achieving better performance with the latter; trained the system with one hundred face images for live recognition.</w:t>
+              <w:t xml:space="preserve">Implemented MTCNN with </w:t>
+            </w:r>
+            <w:proofErr w:type="spellStart"/>
+            <w:r>
+              <w:rPr>
+                <w:rFonts w:ascii="Times New Roman" w:eastAsiaTheme="minorEastAsia" w:hAnsi="Times New Roman" w:cs="Times New Roman"/>
+                <w:bCs/>
+                <w:szCs w:val="22"/>
+              </w:rPr>
+              <w:t>ResNet</w:t>
+            </w:r>
+            <w:proofErr w:type="spellEnd"/>
+            <w:r>
+              <w:rPr>
+                <w:rFonts w:ascii="Times New Roman" w:eastAsiaTheme="minorEastAsia" w:hAnsi="Times New Roman" w:cs="Times New Roman"/>
+                <w:bCs/>
+                <w:szCs w:val="22"/>
+              </w:rPr>
+              <w:t xml:space="preserve"> and </w:t>
+            </w:r>
+            <w:proofErr w:type="spellStart"/>
+            <w:r>
+              <w:rPr>
+                <w:rFonts w:ascii="Times New Roman" w:eastAsiaTheme="minorEastAsia" w:hAnsi="Times New Roman" w:cs="Times New Roman"/>
+                <w:bCs/>
+                <w:szCs w:val="22"/>
+              </w:rPr>
+              <w:t>dlib</w:t>
+            </w:r>
+            <w:proofErr w:type="spellEnd"/>
+            <w:r>
+              <w:rPr>
+                <w:rFonts w:ascii="Times New Roman" w:eastAsiaTheme="minorEastAsia" w:hAnsi="Times New Roman" w:cs="Times New Roman"/>
+                <w:bCs/>
+                <w:szCs w:val="22"/>
+              </w:rPr>
+              <w:t>-based face recognition, achieving better performance with the latter; trained the system with one hundred face images for live recognition.</w:t>
             </w:r>
           </w:p>
           <w:p>
@@ -2898,7 +3087,25 @@
                 <w:bCs/>
                 <w:szCs w:val="22"/>
               </w:rPr>
-              <w:t>Built a custom residual neural network with Keras for speaker recognition, achieving 96% accuracy.</w:t>
+              <w:t xml:space="preserve">Built a custom residual neural network with </w:t>
+            </w:r>
+            <w:proofErr w:type="spellStart"/>
+            <w:r>
+              <w:rPr>
+                <w:rFonts w:ascii="Times New Roman" w:eastAsiaTheme="minorEastAsia" w:hAnsi="Times New Roman" w:cs="Times New Roman"/>
+                <w:bCs/>
+                <w:szCs w:val="22"/>
+              </w:rPr>
+              <w:t>Keras</w:t>
+            </w:r>
+            <w:proofErr w:type="spellEnd"/>
+            <w:r>
+              <w:rPr>
+                <w:rFonts w:ascii="Times New Roman" w:eastAsiaTheme="minorEastAsia" w:hAnsi="Times New Roman" w:cs="Times New Roman"/>
+                <w:bCs/>
+                <w:szCs w:val="22"/>
+              </w:rPr>
+              <w:t xml:space="preserve"> for speaker recognition, achieving 96% accuracy.</w:t>
             </w:r>
           </w:p>
           <w:p>
@@ -2931,8 +3138,8 @@
       <w:tr>
         <w:tc>
           <w:tcPr>
-            <w:tcW w:w="9776" w:type="dxa"/>
-            <w:gridSpan w:val="9"/>
+            <w:tcW w:w="9244" w:type="dxa"/>
+            <w:gridSpan w:val="8"/>
             <w:tcBorders>
               <w:top w:val="nil"/>
               <w:left w:val="nil"/>
@@ -3037,7 +3244,7 @@
         </w:tc>
         <w:tc>
           <w:tcPr>
-            <w:tcW w:w="1559" w:type="dxa"/>
+            <w:tcW w:w="1441" w:type="dxa"/>
             <w:tcBorders>
               <w:top w:val="nil"/>
               <w:left w:val="nil"/>
@@ -3062,8 +3269,8 @@
       <w:tr>
         <w:tc>
           <w:tcPr>
-            <w:tcW w:w="8931" w:type="dxa"/>
-            <w:gridSpan w:val="7"/>
+            <w:tcW w:w="7970" w:type="dxa"/>
+            <w:gridSpan w:val="6"/>
             <w:tcBorders>
               <w:top w:val="nil"/>
               <w:left w:val="nil"/>
@@ -3089,13 +3296,23 @@
               </w:rPr>
               <w:t xml:space="preserve">Course Project (Advisor: Prof. </w:t>
             </w:r>
-            <w:r>
-              <w:rPr>
-                <w:rFonts w:ascii="Times New Roman" w:eastAsiaTheme="minorEastAsia" w:hAnsi="Times New Roman" w:cs="Times New Roman"/>
-                <w:bCs/>
-                <w:szCs w:val="22"/>
-              </w:rPr>
-              <w:t>Zuofu Cheng</w:t>
+            <w:proofErr w:type="spellStart"/>
+            <w:r>
+              <w:rPr>
+                <w:rFonts w:ascii="Times New Roman" w:eastAsiaTheme="minorEastAsia" w:hAnsi="Times New Roman" w:cs="Times New Roman"/>
+                <w:bCs/>
+                <w:szCs w:val="22"/>
+              </w:rPr>
+              <w:t>Zuofu</w:t>
+            </w:r>
+            <w:proofErr w:type="spellEnd"/>
+            <w:r>
+              <w:rPr>
+                <w:rFonts w:ascii="Times New Roman" w:eastAsiaTheme="minorEastAsia" w:hAnsi="Times New Roman" w:cs="Times New Roman"/>
+                <w:bCs/>
+                <w:szCs w:val="22"/>
+              </w:rPr>
+              <w:t xml:space="preserve"> Cheng</w:t>
             </w:r>
             <w:r>
               <w:rPr>
@@ -3109,7 +3326,7 @@
         </w:tc>
         <w:tc>
           <w:tcPr>
-            <w:tcW w:w="2404" w:type="dxa"/>
+            <w:tcW w:w="2715" w:type="dxa"/>
             <w:gridSpan w:val="3"/>
             <w:tcBorders>
               <w:top w:val="nil"/>
@@ -3122,20 +3339,19 @@
             <w:pPr>
               <w:spacing w:after="0" w:line="259" w:lineRule="auto"/>
               <w:ind w:left="0" w:firstLine="0"/>
-              <w:jc w:val="right"/>
-              <w:rPr>
-                <w:rFonts w:ascii="Times New Roman" w:eastAsiaTheme="minorEastAsia" w:hAnsi="Times New Roman" w:cs="Times New Roman"/>
-                <w:bCs/>
-                <w:szCs w:val="22"/>
-              </w:rPr>
-            </w:pPr>
-            <w:r>
-              <w:rPr>
-                <w:rFonts w:ascii="Times New Roman" w:eastAsiaTheme="minorEastAsia" w:hAnsi="Times New Roman" w:cs="Times New Roman" w:hint="eastAsia"/>
-                <w:bCs/>
-                <w:szCs w:val="22"/>
-              </w:rPr>
-              <w:t>March 2024 - May 2024</w:t>
+              <w:rPr>
+                <w:rFonts w:ascii="Times New Roman" w:eastAsiaTheme="minorEastAsia" w:hAnsi="Times New Roman" w:cs="Times New Roman" w:hint="eastAsia"/>
+                <w:bCs/>
+                <w:szCs w:val="22"/>
+              </w:rPr>
+            </w:pPr>
+            <w:r>
+              <w:rPr>
+                <w:rFonts w:ascii="Times New Roman" w:eastAsiaTheme="minorEastAsia" w:hAnsi="Times New Roman" w:cs="Times New Roman" w:hint="eastAsia"/>
+                <w:bCs/>
+                <w:szCs w:val="22"/>
+              </w:rPr>
+              <w:t xml:space="preserve">       March 2024 -May 2024           </w:t>
             </w:r>
           </w:p>
         </w:tc>
@@ -3143,8 +3359,8 @@
       <w:tr>
         <w:tc>
           <w:tcPr>
-            <w:tcW w:w="11335" w:type="dxa"/>
-            <w:gridSpan w:val="10"/>
+            <w:tcW w:w="10685" w:type="dxa"/>
+            <w:gridSpan w:val="9"/>
             <w:tcBorders>
               <w:top w:val="nil"/>
               <w:left w:val="nil"/>
@@ -3185,7 +3401,31 @@
                 <w:sz w:val="20"/>
                 <w:szCs w:val="20"/>
               </w:rPr>
-              <w:t>: SystemVerilog, FPGA</w:t>
+              <w:t xml:space="preserve">: </w:t>
+            </w:r>
+            <w:proofErr w:type="spellStart"/>
+            <w:r>
+              <w:rPr>
+                <w:rFonts w:ascii="Times New Roman" w:eastAsiaTheme="minorEastAsia" w:hAnsi="Times New Roman" w:cs="Times New Roman"/>
+                <w:bCs/>
+                <w:i/>
+                <w:iCs/>
+                <w:sz w:val="20"/>
+                <w:szCs w:val="20"/>
+              </w:rPr>
+              <w:t>SystemVerilog</w:t>
+            </w:r>
+            <w:proofErr w:type="spellEnd"/>
+            <w:r>
+              <w:rPr>
+                <w:rFonts w:ascii="Times New Roman" w:eastAsiaTheme="minorEastAsia" w:hAnsi="Times New Roman" w:cs="Times New Roman"/>
+                <w:bCs/>
+                <w:i/>
+                <w:iCs/>
+                <w:sz w:val="20"/>
+                <w:szCs w:val="20"/>
+              </w:rPr>
+              <w:t>, FPGA</w:t>
             </w:r>
             <w:r>
               <w:rPr>
@@ -3350,8 +3590,8 @@
       <w:tr>
         <w:tc>
           <w:tcPr>
-            <w:tcW w:w="9776" w:type="dxa"/>
-            <w:gridSpan w:val="9"/>
+            <w:tcW w:w="9244" w:type="dxa"/>
+            <w:gridSpan w:val="8"/>
             <w:tcBorders>
               <w:top w:val="nil"/>
               <w:left w:val="nil"/>
@@ -3384,7 +3624,7 @@
         </w:tc>
         <w:tc>
           <w:tcPr>
-            <w:tcW w:w="1559" w:type="dxa"/>
+            <w:tcW w:w="1441" w:type="dxa"/>
             <w:tcBorders>
               <w:top w:val="nil"/>
               <w:left w:val="nil"/>
@@ -3409,7 +3649,7 @@
       <w:tr>
         <w:tc>
           <w:tcPr>
-            <w:tcW w:w="8505" w:type="dxa"/>
+            <w:tcW w:w="7833" w:type="dxa"/>
             <w:gridSpan w:val="5"/>
             <w:tcBorders>
               <w:top w:val="nil"/>
@@ -3464,8 +3704,8 @@
         </w:tc>
         <w:tc>
           <w:tcPr>
-            <w:tcW w:w="2830" w:type="dxa"/>
-            <w:gridSpan w:val="5"/>
+            <w:tcW w:w="2852" w:type="dxa"/>
+            <w:gridSpan w:val="4"/>
             <w:tcBorders>
               <w:top w:val="nil"/>
               <w:left w:val="nil"/>
@@ -3498,8 +3738,8 @@
       <w:tr>
         <w:tc>
           <w:tcPr>
-            <w:tcW w:w="11335" w:type="dxa"/>
-            <w:gridSpan w:val="10"/>
+            <w:tcW w:w="10685" w:type="dxa"/>
+            <w:gridSpan w:val="9"/>
             <w:tcBorders>
               <w:top w:val="nil"/>
               <w:left w:val="nil"/>
@@ -3788,8 +4028,8 @@
       <w:tr>
         <w:tc>
           <w:tcPr>
-            <w:tcW w:w="9776" w:type="dxa"/>
-            <w:gridSpan w:val="9"/>
+            <w:tcW w:w="9244" w:type="dxa"/>
+            <w:gridSpan w:val="8"/>
             <w:tcBorders>
               <w:top w:val="nil"/>
               <w:left w:val="nil"/>
@@ -3819,7 +4059,7 @@
         </w:tc>
         <w:tc>
           <w:tcPr>
-            <w:tcW w:w="1559" w:type="dxa"/>
+            <w:tcW w:w="1441" w:type="dxa"/>
             <w:tcBorders>
               <w:top w:val="nil"/>
               <w:left w:val="nil"/>
@@ -3844,7 +4084,7 @@
       <w:tr>
         <w:tc>
           <w:tcPr>
-            <w:tcW w:w="7083" w:type="dxa"/>
+            <w:tcW w:w="6513" w:type="dxa"/>
             <w:gridSpan w:val="3"/>
             <w:tcBorders>
               <w:top w:val="nil"/>
@@ -3907,8 +4147,8 @@
         </w:tc>
         <w:tc>
           <w:tcPr>
-            <w:tcW w:w="4252" w:type="dxa"/>
-            <w:gridSpan w:val="7"/>
+            <w:tcW w:w="4172" w:type="dxa"/>
+            <w:gridSpan w:val="6"/>
             <w:tcBorders>
               <w:top w:val="nil"/>
               <w:left w:val="nil"/>
@@ -3957,8 +4197,8 @@
       <w:tr>
         <w:tc>
           <w:tcPr>
-            <w:tcW w:w="11335" w:type="dxa"/>
-            <w:gridSpan w:val="10"/>
+            <w:tcW w:w="10685" w:type="dxa"/>
+            <w:gridSpan w:val="9"/>
             <w:tcBorders>
               <w:top w:val="nil"/>
               <w:left w:val="nil"/>
@@ -4069,7 +4309,6 @@
                 <w:bCs/>
                 <w:szCs w:val="22"/>
               </w:rPr>
-              <w:lastRenderedPageBreak/>
               <w:t>Accomplished applications including hooked ball-mitten toys and hairy objects, requiring precise path control to avoid defects and achieve intricate designs.</w:t>
             </w:r>
           </w:p>
@@ -4102,8 +4341,8 @@
       <w:tr>
         <w:tc>
           <w:tcPr>
-            <w:tcW w:w="9067" w:type="dxa"/>
-            <w:gridSpan w:val="8"/>
+            <w:tcW w:w="8593" w:type="dxa"/>
+            <w:gridSpan w:val="7"/>
             <w:tcBorders>
               <w:top w:val="nil"/>
               <w:left w:val="nil"/>
@@ -4127,7 +4366,6 @@
                 <w:b/>
                 <w:szCs w:val="22"/>
               </w:rPr>
-              <w:lastRenderedPageBreak/>
               <w:t>Over-the-Air-Computation Based Federated Learning Model Establishment</w:t>
             </w:r>
             <w:r>
@@ -4150,7 +4388,7 @@
         </w:tc>
         <w:tc>
           <w:tcPr>
-            <w:tcW w:w="2268" w:type="dxa"/>
+            <w:tcW w:w="2092" w:type="dxa"/>
             <w:gridSpan w:val="2"/>
             <w:tcBorders>
               <w:top w:val="nil"/>
@@ -4176,7 +4414,7 @@
       <w:tr>
         <w:tc>
           <w:tcPr>
-            <w:tcW w:w="7083" w:type="dxa"/>
+            <w:tcW w:w="6513" w:type="dxa"/>
             <w:gridSpan w:val="3"/>
             <w:tcBorders>
               <w:top w:val="nil"/>
@@ -4201,6 +4439,7 @@
                 <w:bCs/>
                 <w:szCs w:val="22"/>
               </w:rPr>
+              <w:lastRenderedPageBreak/>
               <w:t xml:space="preserve">Zhejiang University </w:t>
             </w:r>
             <w:r>
@@ -4247,8 +4486,8 @@
         </w:tc>
         <w:tc>
           <w:tcPr>
-            <w:tcW w:w="4252" w:type="dxa"/>
-            <w:gridSpan w:val="7"/>
+            <w:tcW w:w="4172" w:type="dxa"/>
+            <w:gridSpan w:val="6"/>
             <w:tcBorders>
               <w:top w:val="nil"/>
               <w:left w:val="nil"/>
@@ -4305,8 +4544,8 @@
       <w:tr>
         <w:tc>
           <w:tcPr>
-            <w:tcW w:w="11335" w:type="dxa"/>
-            <w:gridSpan w:val="10"/>
+            <w:tcW w:w="10685" w:type="dxa"/>
+            <w:gridSpan w:val="9"/>
             <w:tcBorders>
               <w:top w:val="nil"/>
               <w:left w:val="nil"/>
@@ -4487,7 +4726,7 @@
         </w:trPr>
         <w:tc>
           <w:tcPr>
-            <w:tcW w:w="7083" w:type="dxa"/>
+            <w:tcW w:w="6513" w:type="dxa"/>
             <w:gridSpan w:val="3"/>
             <w:tcBorders>
               <w:top w:val="nil"/>
@@ -4561,8 +4800,8 @@
         </w:tc>
         <w:tc>
           <w:tcPr>
-            <w:tcW w:w="4252" w:type="dxa"/>
-            <w:gridSpan w:val="7"/>
+            <w:tcW w:w="4172" w:type="dxa"/>
+            <w:gridSpan w:val="6"/>
             <w:tcBorders>
               <w:top w:val="nil"/>
               <w:left w:val="nil"/>
@@ -4590,7 +4829,7 @@
         </w:trPr>
         <w:tc>
           <w:tcPr>
-            <w:tcW w:w="6091" w:type="dxa"/>
+            <w:tcW w:w="5595" w:type="dxa"/>
             <w:gridSpan w:val="2"/>
             <w:tcBorders>
               <w:top w:val="single" w:sz="4" w:space="0" w:color="auto"/>
@@ -4620,7 +4859,7 @@
         </w:tc>
         <w:tc>
           <w:tcPr>
-            <w:tcW w:w="2551" w:type="dxa"/>
+            <w:tcW w:w="2375" w:type="dxa"/>
             <w:gridSpan w:val="4"/>
             <w:tcBorders>
               <w:top w:val="single" w:sz="4" w:space="0" w:color="auto"/>
@@ -4654,8 +4893,8 @@
         </w:tc>
         <w:tc>
           <w:tcPr>
-            <w:tcW w:w="2693" w:type="dxa"/>
-            <w:gridSpan w:val="4"/>
+            <w:tcW w:w="2715" w:type="dxa"/>
+            <w:gridSpan w:val="3"/>
             <w:tcBorders>
               <w:top w:val="single" w:sz="4" w:space="0" w:color="auto"/>
               <w:bottom w:val="nil"/>
@@ -4690,7 +4929,7 @@
         </w:trPr>
         <w:tc>
           <w:tcPr>
-            <w:tcW w:w="6091" w:type="dxa"/>
+            <w:tcW w:w="5595" w:type="dxa"/>
             <w:gridSpan w:val="2"/>
             <w:tcBorders>
               <w:top w:val="nil"/>
@@ -4728,7 +4967,7 @@
         </w:tc>
         <w:tc>
           <w:tcPr>
-            <w:tcW w:w="2551" w:type="dxa"/>
+            <w:tcW w:w="2375" w:type="dxa"/>
             <w:gridSpan w:val="4"/>
             <w:tcBorders>
               <w:top w:val="nil"/>
@@ -4762,8 +5001,8 @@
         </w:tc>
         <w:tc>
           <w:tcPr>
-            <w:tcW w:w="2693" w:type="dxa"/>
-            <w:gridSpan w:val="4"/>
+            <w:tcW w:w="2715" w:type="dxa"/>
+            <w:gridSpan w:val="3"/>
             <w:tcBorders>
               <w:top w:val="nil"/>
               <w:bottom w:val="nil"/>
@@ -4798,7 +5037,7 @@
         </w:trPr>
         <w:tc>
           <w:tcPr>
-            <w:tcW w:w="6091" w:type="dxa"/>
+            <w:tcW w:w="5595" w:type="dxa"/>
             <w:gridSpan w:val="2"/>
             <w:tcBorders>
               <w:top w:val="nil"/>
@@ -4828,7 +5067,7 @@
         </w:tc>
         <w:tc>
           <w:tcPr>
-            <w:tcW w:w="2551" w:type="dxa"/>
+            <w:tcW w:w="2375" w:type="dxa"/>
             <w:gridSpan w:val="4"/>
             <w:tcBorders>
               <w:top w:val="nil"/>
@@ -4862,8 +5101,8 @@
         </w:tc>
         <w:tc>
           <w:tcPr>
-            <w:tcW w:w="2693" w:type="dxa"/>
-            <w:gridSpan w:val="4"/>
+            <w:tcW w:w="2715" w:type="dxa"/>
+            <w:gridSpan w:val="3"/>
             <w:tcBorders>
               <w:top w:val="nil"/>
               <w:bottom w:val="nil"/>
@@ -4962,7 +5201,7 @@
         </w:trPr>
         <w:tc>
           <w:tcPr>
-            <w:tcW w:w="6091" w:type="dxa"/>
+            <w:tcW w:w="5595" w:type="dxa"/>
             <w:gridSpan w:val="2"/>
             <w:tcBorders>
               <w:top w:val="nil"/>
@@ -4992,7 +5231,7 @@
         </w:tc>
         <w:tc>
           <w:tcPr>
-            <w:tcW w:w="2551" w:type="dxa"/>
+            <w:tcW w:w="2375" w:type="dxa"/>
             <w:gridSpan w:val="4"/>
             <w:tcBorders>
               <w:top w:val="nil"/>
@@ -5026,8 +5265,8 @@
         </w:tc>
         <w:tc>
           <w:tcPr>
-            <w:tcW w:w="2693" w:type="dxa"/>
-            <w:gridSpan w:val="4"/>
+            <w:tcW w:w="2715" w:type="dxa"/>
+            <w:gridSpan w:val="3"/>
             <w:tcBorders>
               <w:top w:val="nil"/>
               <w:bottom w:val="nil"/>
@@ -5126,7 +5365,7 @@
         </w:trPr>
         <w:tc>
           <w:tcPr>
-            <w:tcW w:w="6091" w:type="dxa"/>
+            <w:tcW w:w="5595" w:type="dxa"/>
             <w:gridSpan w:val="2"/>
             <w:tcBorders>
               <w:top w:val="nil"/>
@@ -5158,7 +5397,7 @@
         </w:tc>
         <w:tc>
           <w:tcPr>
-            <w:tcW w:w="2551" w:type="dxa"/>
+            <w:tcW w:w="2375" w:type="dxa"/>
             <w:gridSpan w:val="4"/>
             <w:tcBorders>
               <w:top w:val="nil"/>
@@ -5192,8 +5431,8 @@
         </w:tc>
         <w:tc>
           <w:tcPr>
-            <w:tcW w:w="2693" w:type="dxa"/>
-            <w:gridSpan w:val="4"/>
+            <w:tcW w:w="2715" w:type="dxa"/>
+            <w:gridSpan w:val="3"/>
             <w:tcBorders>
               <w:top w:val="nil"/>
               <w:bottom w:val="nil"/>
@@ -5228,7 +5467,7 @@
         </w:trPr>
         <w:tc>
           <w:tcPr>
-            <w:tcW w:w="6091" w:type="dxa"/>
+            <w:tcW w:w="5595" w:type="dxa"/>
             <w:gridSpan w:val="2"/>
             <w:tcBorders>
               <w:top w:val="nil"/>
@@ -5258,7 +5497,7 @@
         </w:tc>
         <w:tc>
           <w:tcPr>
-            <w:tcW w:w="2551" w:type="dxa"/>
+            <w:tcW w:w="2375" w:type="dxa"/>
             <w:gridSpan w:val="4"/>
             <w:tcBorders>
               <w:top w:val="nil"/>
@@ -5292,8 +5531,8 @@
         </w:tc>
         <w:tc>
           <w:tcPr>
-            <w:tcW w:w="2693" w:type="dxa"/>
-            <w:gridSpan w:val="4"/>
+            <w:tcW w:w="2715" w:type="dxa"/>
+            <w:gridSpan w:val="3"/>
             <w:tcBorders>
               <w:top w:val="nil"/>
               <w:bottom w:val="nil"/>
@@ -5328,7 +5567,7 @@
         </w:trPr>
         <w:tc>
           <w:tcPr>
-            <w:tcW w:w="6091" w:type="dxa"/>
+            <w:tcW w:w="5595" w:type="dxa"/>
             <w:gridSpan w:val="2"/>
             <w:tcBorders>
               <w:top w:val="nil"/>
@@ -5374,7 +5613,7 @@
         </w:tc>
         <w:tc>
           <w:tcPr>
-            <w:tcW w:w="2551" w:type="dxa"/>
+            <w:tcW w:w="2375" w:type="dxa"/>
             <w:gridSpan w:val="4"/>
             <w:tcBorders>
               <w:top w:val="nil"/>
@@ -5408,8 +5647,8 @@
         </w:tc>
         <w:tc>
           <w:tcPr>
-            <w:tcW w:w="2693" w:type="dxa"/>
-            <w:gridSpan w:val="4"/>
+            <w:tcW w:w="2715" w:type="dxa"/>
+            <w:gridSpan w:val="3"/>
             <w:tcBorders>
               <w:top w:val="nil"/>
               <w:bottom w:val="nil"/>
@@ -5444,7 +5683,7 @@
         </w:trPr>
         <w:tc>
           <w:tcPr>
-            <w:tcW w:w="7083" w:type="dxa"/>
+            <w:tcW w:w="6513" w:type="dxa"/>
             <w:gridSpan w:val="3"/>
             <w:tcBorders>
               <w:top w:val="nil"/>
@@ -5491,8 +5730,8 @@
         </w:tc>
         <w:tc>
           <w:tcPr>
-            <w:tcW w:w="4252" w:type="dxa"/>
-            <w:gridSpan w:val="7"/>
+            <w:tcW w:w="4172" w:type="dxa"/>
+            <w:gridSpan w:val="6"/>
             <w:tcBorders>
               <w:top w:val="nil"/>
               <w:left w:val="nil"/>
@@ -5517,8 +5756,8 @@
       <w:tr>
         <w:tc>
           <w:tcPr>
-            <w:tcW w:w="11335" w:type="dxa"/>
-            <w:gridSpan w:val="10"/>
+            <w:tcW w:w="10685" w:type="dxa"/>
+            <w:gridSpan w:val="9"/>
             <w:tcBorders>
               <w:top w:val="single" w:sz="4" w:space="0" w:color="auto"/>
               <w:left w:val="nil"/>
@@ -5606,23 +5845,13 @@
                 <w:szCs w:val="22"/>
               </w:rPr>
             </w:pPr>
-            <w:proofErr w:type="gramStart"/>
-            <w:r>
-              <w:rPr>
-                <w:rFonts w:ascii="Times New Roman" w:eastAsiaTheme="minorEastAsia" w:hAnsi="Times New Roman" w:cs="Times New Roman"/>
-                <w:bCs/>
-                <w:szCs w:val="22"/>
-              </w:rPr>
-              <w:t>Hardwares</w:t>
-            </w:r>
-            <w:proofErr w:type="gramEnd"/>
-            <w:r>
-              <w:rPr>
-                <w:rFonts w:ascii="Times New Roman" w:eastAsiaTheme="minorEastAsia" w:hAnsi="Times New Roman" w:cs="Times New Roman"/>
-                <w:bCs/>
-                <w:szCs w:val="22"/>
-              </w:rPr>
-              <w:t xml:space="preserve">: </w:t>
+            <w:r>
+              <w:rPr>
+                <w:rFonts w:ascii="Times New Roman" w:eastAsiaTheme="minorEastAsia" w:hAnsi="Times New Roman" w:cs="Times New Roman"/>
+                <w:bCs/>
+                <w:szCs w:val="22"/>
+              </w:rPr>
+              <w:t xml:space="preserve">Hardwares: </w:t>
             </w:r>
             <w:r>
               <w:rPr>

</xml_diff>